<commit_message>
Ajout des étiquettes "contenu" modification tokens
</commit_message>
<xml_diff>
--- a/docs/modeles_civicrm_vierges/044-OPP_FUN-info_date_cremation_avec_restitution.docx
+++ b/docs/modeles_civicrm_vierges/044-OPP_FUN-info_date_cremation_avec_restitution.docx
@@ -1,6 +1,6 @@
 
 <file path=word/document.xml><?xml version="1.0" encoding="utf-8"?>
-<w:document xmlns:wpc="http://schemas.microsoft.com/office/word/2010/wordprocessingCanvas" xmlns:cx="http://schemas.microsoft.com/office/drawing/2014/chartex" xmlns:cx1="http://schemas.microsoft.com/office/drawing/2015/9/8/chartex" xmlns:cx2="http://schemas.microsoft.com/office/drawing/2015/10/21/chartex" xmlns:cx3="http://schemas.microsoft.com/office/drawing/2016/5/9/chartex" xmlns:cx4="http://schemas.microsoft.com/office/drawing/2016/5/10/chartex" xmlns:cx5="http://schemas.microsoft.com/office/drawing/2016/5/11/chartex" xmlns:cx6="http://schemas.microsoft.com/office/drawing/2016/5/12/chartex" xmlns:cx7="http://schemas.microsoft.com/office/drawing/2016/5/13/chartex" xmlns:cx8="http://schemas.microsoft.com/office/drawing/2016/5/14/chartex" xmlns:mc="http://schemas.openxmlformats.org/markup-compatibility/2006" xmlns:aink="http://schemas.microsoft.com/office/drawing/2016/ink" xmlns:am3d="http://schemas.microsoft.com/office/drawing/2017/model3d" xmlns:o="urn:schemas-microsoft-com:office:office" xmlns:oel="http://schemas.microsoft.com/office/2019/extlst" xmlns:r="http://schemas.openxmlformats.org/officeDocument/2006/relationships" xmlns:m="http://schemas.openxmlformats.org/officeDocument/2006/math" xmlns:v="urn:schemas-microsoft-com:vml" xmlns:wp14="http://schemas.microsoft.com/office/word/2010/wordprocessingDrawing" xmlns:wp="http://schemas.openxmlformats.org/drawingml/2006/wordprocessingDrawing" xmlns:w10="urn:schemas-microsoft-com:office:word" xmlns:w="http://schemas.openxmlformats.org/wordprocessingml/2006/main" xmlns:w14="http://schemas.microsoft.com/office/word/2010/wordml" xmlns:w15="http://schemas.microsoft.com/office/word/2012/wordml" xmlns:w16cex="http://schemas.microsoft.com/office/word/2018/wordml/cex" xmlns:w16cid="http://schemas.microsoft.com/office/word/2016/wordml/cid" xmlns:w16="http://schemas.microsoft.com/office/word/2018/wordml" xmlns:w16du="http://schemas.microsoft.com/office/word/2023/wordml/word16du" xmlns:w16sdtdh="http://schemas.microsoft.com/office/word/2020/wordml/sdtdatahash" xmlns:w16sdtfl="http://schemas.microsoft.com/office/word/2024/wordml/sdtformatlock" xmlns:w16se="http://schemas.microsoft.com/office/word/2015/wordml/symex" xmlns:wpg="http://schemas.microsoft.com/office/word/2010/wordprocessingGroup" xmlns:wpi="http://schemas.microsoft.com/office/word/2010/wordprocessingInk" xmlns:wne="http://schemas.microsoft.com/office/word/2006/wordml" xmlns:wps="http://schemas.microsoft.com/office/word/2010/wordprocessingShape" mc:Ignorable="w14 w15 w16se w16cid w16 w16cex w16sdtdh w16sdtfl w16du wp14">
+<w:document xmlns:wpc="http://schemas.microsoft.com/office/word/2010/wordprocessingCanvas" xmlns:cx="http://schemas.microsoft.com/office/drawing/2014/chartex" xmlns:cx1="http://schemas.microsoft.com/office/drawing/2015/9/8/chartex" xmlns:cx2="http://schemas.microsoft.com/office/drawing/2015/10/21/chartex" xmlns:cx3="http://schemas.microsoft.com/office/drawing/2016/5/9/chartex" xmlns:cx4="http://schemas.microsoft.com/office/drawing/2016/5/10/chartex" xmlns:cx5="http://schemas.microsoft.com/office/drawing/2016/5/11/chartex" xmlns:cx6="http://schemas.microsoft.com/office/drawing/2016/5/12/chartex" xmlns:cx7="http://schemas.microsoft.com/office/drawing/2016/5/13/chartex" xmlns:cx8="http://schemas.microsoft.com/office/drawing/2016/5/14/chartex" xmlns:mc="http://schemas.openxmlformats.org/markup-compatibility/2006" xmlns:m="http://schemas.openxmlformats.org/officeDocument/2006/math" xmlns:aink="http://schemas.microsoft.com/office/drawing/2016/ink" xmlns:am3d="http://schemas.microsoft.com/office/drawing/2017/model3d" xmlns:oel="http://schemas.microsoft.com/office/2019/extlst" xmlns:r="http://schemas.openxmlformats.org/officeDocument/2006/relationships" xmlns:wp14="http://schemas.microsoft.com/office/word/2010/wordprocessingDrawing" xmlns:wp="http://schemas.openxmlformats.org/drawingml/2006/wordprocessingDrawing" xmlns:wpg="http://schemas.microsoft.com/office/word/2010/wordprocessingGroup" xmlns:wpi="http://schemas.microsoft.com/office/word/2010/wordprocessingInk" xmlns:wps="http://schemas.microsoft.com/office/word/2010/wordprocessingShape" xmlns:o="urn:schemas-microsoft-com:office:office" xmlns:v="urn:schemas-microsoft-com:vml" xmlns:w10="urn:schemas-microsoft-com:office:word" xmlns:w="http://schemas.openxmlformats.org/wordprocessingml/2006/main" xmlns:w14="http://schemas.microsoft.com/office/word/2010/wordml" xmlns:w15="http://schemas.microsoft.com/office/word/2012/wordml" xmlns:w16cex="http://schemas.microsoft.com/office/word/2018/wordml/cex" xmlns:w16cid="http://schemas.microsoft.com/office/word/2016/wordml/cid" xmlns:w16="http://schemas.microsoft.com/office/word/2018/wordml" xmlns:w16sdtdh="http://schemas.microsoft.com/office/word/2020/wordml/sdtdatahash" xmlns:w16sdtfl="http://schemas.microsoft.com/office/word/2024/wordml/sdtformatlock" xmlns:w16se="http://schemas.microsoft.com/office/word/2015/wordml/symex" xmlns:w16du="http://schemas.microsoft.com/office/word/2023/wordml/word16du" xmlns:wne="http://schemas.microsoft.com/office/word/2006/wordml" mc:Ignorable="w14 w15 w16se w16cid w16 w16cex w16sdtdh w16sdtfl w16du wp14">
   <w:body>
     <w:tbl>
       <w:tblPr>
@@ -407,408 +407,561 @@
           <w:tcPr>
             <w:tcW w:w="5302" w:type="dxa"/>
           </w:tcPr>
-          <w:p>
-            <w:pPr>
-              <w:pStyle w:val="Contenudetableau"/>
-              <w:ind w:left="283"/>
-              <w:rPr>
-                <w:rFonts w:ascii="Arial" w:hAnsi="Arial" w:cs="Arial"/>
-                <w:sz w:val="18"/>
-                <w:szCs w:val="18"/>
-                <w:lang w:val="en-US"/>
-              </w:rPr>
-            </w:pPr>
-            <w:r>
-              <w:rPr>
-                <w:rFonts w:ascii="Arial" w:hAnsi="Arial" w:cs="Arial"/>
-                <w:sz w:val="18"/>
-                <w:szCs w:val="18"/>
-                <w:lang w:val="en-US"/>
-              </w:rPr>
-              <w:t>{Tokens_PAQPF_Champs_de_fusion_</w:t>
-            </w:r>
-            <w:proofErr w:type="gramStart"/>
-            <w:r>
-              <w:rPr>
-                <w:rFonts w:ascii="Arial" w:hAnsi="Arial" w:cs="Arial"/>
-                <w:sz w:val="18"/>
-                <w:szCs w:val="18"/>
-                <w:lang w:val="en-US"/>
-              </w:rPr>
-              <w:t>1.Contact</w:t>
-            </w:r>
-            <w:proofErr w:type="gramEnd"/>
-            <w:r>
-              <w:rPr>
-                <w:rFonts w:ascii="Arial" w:hAnsi="Arial" w:cs="Arial"/>
-                <w:sz w:val="18"/>
-                <w:szCs w:val="18"/>
-                <w:lang w:val="en-US"/>
-              </w:rPr>
-              <w:t>_RelationshipCache_Contact_</w:t>
-            </w:r>
-            <w:proofErr w:type="gramStart"/>
-            <w:r>
-              <w:rPr>
-                <w:rFonts w:ascii="Arial" w:hAnsi="Arial" w:cs="Arial"/>
-                <w:sz w:val="18"/>
-                <w:szCs w:val="18"/>
-                <w:lang w:val="en-US"/>
-              </w:rPr>
-              <w:t>01.postal</w:t>
-            </w:r>
-            <w:proofErr w:type="gramEnd"/>
-            <w:r>
-              <w:rPr>
-                <w:rFonts w:ascii="Arial" w:hAnsi="Arial" w:cs="Arial"/>
-                <w:sz w:val="18"/>
-                <w:szCs w:val="18"/>
-                <w:lang w:val="en-US"/>
-              </w:rPr>
-              <w:t>_greeting_display} {Tokens_PAQPF_Champs_de_fusion_</w:t>
-            </w:r>
-            <w:proofErr w:type="gramStart"/>
-            <w:r>
-              <w:rPr>
-                <w:rFonts w:ascii="Arial" w:hAnsi="Arial" w:cs="Arial"/>
-                <w:sz w:val="18"/>
-                <w:szCs w:val="18"/>
-                <w:lang w:val="en-US"/>
-              </w:rPr>
-              <w:t>1.CONCAT</w:t>
-            </w:r>
-            <w:proofErr w:type="gramEnd"/>
-            <w:r>
-              <w:rPr>
-                <w:rFonts w:ascii="Arial" w:hAnsi="Arial" w:cs="Arial"/>
-                <w:sz w:val="18"/>
-                <w:szCs w:val="18"/>
-                <w:lang w:val="en-US"/>
-              </w:rPr>
-              <w:t>_WS_Contact_RelationshipCache_Contact_01_last_name_Contact_RelationshipCache_Contact_01_nick_name}</w:t>
-            </w:r>
-          </w:p>
-          <w:p>
-            <w:pPr>
-              <w:pStyle w:val="Contenudetableau"/>
-              <w:ind w:left="283"/>
-              <w:rPr>
-                <w:rFonts w:ascii="Arial" w:hAnsi="Arial" w:cs="Arial"/>
-                <w:sz w:val="18"/>
-                <w:szCs w:val="18"/>
-                <w:lang w:val="en-US"/>
-              </w:rPr>
-            </w:pPr>
-            <w:r>
-              <w:rPr>
-                <w:rFonts w:ascii="Arial" w:hAnsi="Arial" w:cs="Arial"/>
-                <w:sz w:val="18"/>
-                <w:szCs w:val="18"/>
-                <w:lang w:val="en-US"/>
-              </w:rPr>
-              <w:t>{Tokens_PAQPF_Champs_de_fusion_</w:t>
-            </w:r>
-            <w:proofErr w:type="gramStart"/>
-            <w:r>
-              <w:rPr>
-                <w:rFonts w:ascii="Arial" w:hAnsi="Arial" w:cs="Arial"/>
-                <w:sz w:val="18"/>
-                <w:szCs w:val="18"/>
-                <w:lang w:val="en-US"/>
-              </w:rPr>
-              <w:t>1.Contact</w:t>
-            </w:r>
-            <w:proofErr w:type="gramEnd"/>
-            <w:r>
-              <w:rPr>
-                <w:rFonts w:ascii="Arial" w:hAnsi="Arial" w:cs="Arial"/>
-                <w:sz w:val="18"/>
-                <w:szCs w:val="18"/>
-                <w:lang w:val="en-US"/>
-              </w:rPr>
-              <w:t>_RelationshipCache_Contact_</w:t>
-            </w:r>
-            <w:proofErr w:type="gramStart"/>
-            <w:r>
-              <w:rPr>
-                <w:rFonts w:ascii="Arial" w:hAnsi="Arial" w:cs="Arial"/>
-                <w:sz w:val="18"/>
-                <w:szCs w:val="18"/>
-                <w:lang w:val="en-US"/>
-              </w:rPr>
-              <w:t>01.address</w:t>
-            </w:r>
-            <w:proofErr w:type="gramEnd"/>
-            <w:r>
-              <w:rPr>
-                <w:rFonts w:ascii="Arial" w:hAnsi="Arial" w:cs="Arial"/>
-                <w:sz w:val="18"/>
-                <w:szCs w:val="18"/>
-                <w:lang w:val="en-US"/>
-              </w:rPr>
-              <w:t>_</w:t>
-            </w:r>
-            <w:proofErr w:type="gramStart"/>
-            <w:r>
-              <w:rPr>
-                <w:rFonts w:ascii="Arial" w:hAnsi="Arial" w:cs="Arial"/>
-                <w:sz w:val="18"/>
-                <w:szCs w:val="18"/>
-                <w:lang w:val="en-US"/>
-              </w:rPr>
-              <w:t>primary.street</w:t>
-            </w:r>
-            <w:proofErr w:type="gramEnd"/>
-            <w:r>
-              <w:rPr>
-                <w:rFonts w:ascii="Arial" w:hAnsi="Arial" w:cs="Arial"/>
-                <w:sz w:val="18"/>
-                <w:szCs w:val="18"/>
-                <w:lang w:val="en-US"/>
-              </w:rPr>
-              <w:t>_address}</w:t>
-            </w:r>
-          </w:p>
-          <w:p>
-            <w:pPr>
-              <w:pStyle w:val="Contenudetableau"/>
-              <w:ind w:left="283"/>
-              <w:rPr>
-                <w:rFonts w:ascii="Arial" w:hAnsi="Arial" w:cs="Arial"/>
-                <w:sz w:val="18"/>
-                <w:szCs w:val="18"/>
-                <w:lang w:val="en-US"/>
-              </w:rPr>
-            </w:pPr>
-            <w:r>
-              <w:rPr>
-                <w:rFonts w:ascii="Arial" w:hAnsi="Arial" w:cs="Arial"/>
-                <w:sz w:val="18"/>
-                <w:szCs w:val="18"/>
-                <w:lang w:val="en-US"/>
-              </w:rPr>
-              <w:t>{Tokens_PAQPF_Champs_de_fusion_</w:t>
-            </w:r>
-            <w:proofErr w:type="gramStart"/>
-            <w:r>
-              <w:rPr>
-                <w:rFonts w:ascii="Arial" w:hAnsi="Arial" w:cs="Arial"/>
-                <w:sz w:val="18"/>
-                <w:szCs w:val="18"/>
-                <w:lang w:val="en-US"/>
-              </w:rPr>
-              <w:t>1.Contact</w:t>
-            </w:r>
-            <w:proofErr w:type="gramEnd"/>
-            <w:r>
-              <w:rPr>
-                <w:rFonts w:ascii="Arial" w:hAnsi="Arial" w:cs="Arial"/>
-                <w:sz w:val="18"/>
-                <w:szCs w:val="18"/>
-                <w:lang w:val="en-US"/>
-              </w:rPr>
-              <w:t>_RelationshipCache_Contact_</w:t>
-            </w:r>
-            <w:proofErr w:type="gramStart"/>
-            <w:r>
-              <w:rPr>
-                <w:rFonts w:ascii="Arial" w:hAnsi="Arial" w:cs="Arial"/>
-                <w:sz w:val="18"/>
-                <w:szCs w:val="18"/>
-                <w:lang w:val="en-US"/>
-              </w:rPr>
-              <w:t>01.address</w:t>
-            </w:r>
-            <w:proofErr w:type="gramEnd"/>
-            <w:r>
-              <w:rPr>
-                <w:rFonts w:ascii="Arial" w:hAnsi="Arial" w:cs="Arial"/>
-                <w:sz w:val="18"/>
-                <w:szCs w:val="18"/>
-                <w:lang w:val="en-US"/>
-              </w:rPr>
-              <w:t>_</w:t>
-            </w:r>
-            <w:proofErr w:type="gramStart"/>
-            <w:r>
-              <w:rPr>
-                <w:rFonts w:ascii="Arial" w:hAnsi="Arial" w:cs="Arial"/>
-                <w:sz w:val="18"/>
-                <w:szCs w:val="18"/>
-                <w:lang w:val="en-US"/>
-              </w:rPr>
-              <w:t>primary.supplemental</w:t>
-            </w:r>
-            <w:proofErr w:type="gramEnd"/>
-            <w:r>
-              <w:rPr>
-                <w:rFonts w:ascii="Arial" w:hAnsi="Arial" w:cs="Arial"/>
-                <w:sz w:val="18"/>
-                <w:szCs w:val="18"/>
-                <w:lang w:val="en-US"/>
-              </w:rPr>
-              <w:t>_address_1}</w:t>
-            </w:r>
-          </w:p>
-          <w:p>
-            <w:pPr>
-              <w:pStyle w:val="Contenudetableau"/>
-              <w:ind w:left="283"/>
-              <w:rPr>
-                <w:rFonts w:ascii="Arial" w:hAnsi="Arial" w:cs="Arial"/>
-                <w:sz w:val="18"/>
-                <w:szCs w:val="18"/>
-                <w:lang w:val="en-US"/>
-              </w:rPr>
-            </w:pPr>
-            <w:r>
-              <w:rPr>
-                <w:rFonts w:ascii="Arial" w:hAnsi="Arial" w:cs="Arial"/>
-                <w:sz w:val="18"/>
-                <w:szCs w:val="18"/>
-                <w:lang w:val="en-US"/>
-              </w:rPr>
-              <w:t>{Tokens_PAQPF_Champs_de_fusion_</w:t>
-            </w:r>
-            <w:proofErr w:type="gramStart"/>
-            <w:r>
-              <w:rPr>
-                <w:rFonts w:ascii="Arial" w:hAnsi="Arial" w:cs="Arial"/>
-                <w:sz w:val="18"/>
-                <w:szCs w:val="18"/>
-                <w:lang w:val="en-US"/>
-              </w:rPr>
-              <w:t>1.Contact</w:t>
-            </w:r>
-            <w:proofErr w:type="gramEnd"/>
-            <w:r>
-              <w:rPr>
-                <w:rFonts w:ascii="Arial" w:hAnsi="Arial" w:cs="Arial"/>
-                <w:sz w:val="18"/>
-                <w:szCs w:val="18"/>
-                <w:lang w:val="en-US"/>
-              </w:rPr>
-              <w:t>_RelationshipCache_Contact_</w:t>
-            </w:r>
-            <w:proofErr w:type="gramStart"/>
-            <w:r>
-              <w:rPr>
-                <w:rFonts w:ascii="Arial" w:hAnsi="Arial" w:cs="Arial"/>
-                <w:sz w:val="18"/>
-                <w:szCs w:val="18"/>
-                <w:lang w:val="en-US"/>
-              </w:rPr>
-              <w:t>01.address</w:t>
-            </w:r>
-            <w:proofErr w:type="gramEnd"/>
-            <w:r>
-              <w:rPr>
-                <w:rFonts w:ascii="Arial" w:hAnsi="Arial" w:cs="Arial"/>
-                <w:sz w:val="18"/>
-                <w:szCs w:val="18"/>
-                <w:lang w:val="en-US"/>
-              </w:rPr>
-              <w:t>_</w:t>
-            </w:r>
-            <w:proofErr w:type="gramStart"/>
-            <w:r>
-              <w:rPr>
-                <w:rFonts w:ascii="Arial" w:hAnsi="Arial" w:cs="Arial"/>
-                <w:sz w:val="18"/>
-                <w:szCs w:val="18"/>
-                <w:lang w:val="en-US"/>
-              </w:rPr>
-              <w:t>primary.postal</w:t>
-            </w:r>
-            <w:proofErr w:type="gramEnd"/>
-            <w:r>
-              <w:rPr>
-                <w:rFonts w:ascii="Arial" w:hAnsi="Arial" w:cs="Arial"/>
-                <w:sz w:val="18"/>
-                <w:szCs w:val="18"/>
-                <w:lang w:val="en-US"/>
-              </w:rPr>
-              <w:t>_code}</w:t>
-            </w:r>
-            <w:r>
-              <w:rPr>
-                <w:rFonts w:ascii="Arial" w:hAnsi="Arial" w:cs="Arial"/>
-                <w:sz w:val="18"/>
-                <w:szCs w:val="18"/>
-                <w:lang w:val="en-US"/>
-              </w:rPr>
-              <w:t xml:space="preserve"> </w:t>
-            </w:r>
-            <w:r>
-              <w:rPr>
-                <w:rFonts w:ascii="Arial" w:hAnsi="Arial" w:cs="Arial"/>
-                <w:sz w:val="18"/>
-                <w:szCs w:val="18"/>
-                <w:lang w:val="en-US"/>
-              </w:rPr>
-              <w:t>{Tokens_PAQPF_Champs_de_fusion_</w:t>
-            </w:r>
-            <w:proofErr w:type="gramStart"/>
-            <w:r>
-              <w:rPr>
-                <w:rFonts w:ascii="Arial" w:hAnsi="Arial" w:cs="Arial"/>
-                <w:sz w:val="18"/>
-                <w:szCs w:val="18"/>
-                <w:lang w:val="en-US"/>
-              </w:rPr>
-              <w:t>1.Contact</w:t>
-            </w:r>
-            <w:proofErr w:type="gramEnd"/>
-            <w:r>
-              <w:rPr>
-                <w:rFonts w:ascii="Arial" w:hAnsi="Arial" w:cs="Arial"/>
-                <w:sz w:val="18"/>
-                <w:szCs w:val="18"/>
-                <w:lang w:val="en-US"/>
-              </w:rPr>
-              <w:t>_RelationshipCache_Contact_</w:t>
-            </w:r>
-            <w:proofErr w:type="gramStart"/>
-            <w:r>
-              <w:rPr>
-                <w:rFonts w:ascii="Arial" w:hAnsi="Arial" w:cs="Arial"/>
-                <w:sz w:val="18"/>
-                <w:szCs w:val="18"/>
-                <w:lang w:val="en-US"/>
-              </w:rPr>
-              <w:t>01.address</w:t>
-            </w:r>
-            <w:proofErr w:type="gramEnd"/>
-            <w:r>
-              <w:rPr>
-                <w:rFonts w:ascii="Arial" w:hAnsi="Arial" w:cs="Arial"/>
-                <w:sz w:val="18"/>
-                <w:szCs w:val="18"/>
-                <w:lang w:val="en-US"/>
-              </w:rPr>
-              <w:t>_</w:t>
-            </w:r>
-            <w:proofErr w:type="gramStart"/>
-            <w:r>
-              <w:rPr>
-                <w:rFonts w:ascii="Arial" w:hAnsi="Arial" w:cs="Arial"/>
-                <w:sz w:val="18"/>
-                <w:szCs w:val="18"/>
-                <w:lang w:val="en-US"/>
-              </w:rPr>
-              <w:t>primary.city</w:t>
-            </w:r>
-            <w:proofErr w:type="gramEnd"/>
-            <w:r>
-              <w:rPr>
-                <w:rFonts w:ascii="Arial" w:hAnsi="Arial" w:cs="Arial"/>
-                <w:sz w:val="18"/>
-                <w:szCs w:val="18"/>
-                <w:lang w:val="en-US"/>
-              </w:rPr>
-              <w:t>}</w:t>
-            </w:r>
-          </w:p>
+          <w:tbl>
+            <w:tblPr>
+              <w:tblpPr w:leftFromText="141" w:rightFromText="141" w:vertAnchor="text" w:tblpY="87"/>
+              <w:tblW w:w="5108" w:type="pct"/>
+              <w:tblLayout w:type="fixed"/>
+              <w:tblCellMar>
+                <w:left w:w="0" w:type="dxa"/>
+                <w:right w:w="0" w:type="dxa"/>
+              </w:tblCellMar>
+              <w:tblLook w:val="04A0" w:firstRow="1" w:lastRow="0" w:firstColumn="1" w:lastColumn="0" w:noHBand="0" w:noVBand="1"/>
+            </w:tblPr>
+            <w:tblGrid>
+              <w:gridCol w:w="5417"/>
+            </w:tblGrid>
+            <w:tr>
+              <w:tc>
+                <w:tcPr>
+                  <w:tcW w:w="5302" w:type="dxa"/>
+                </w:tcPr>
+                <w:p>
+                  <w:pPr>
+                    <w:pStyle w:val="Contenudetableau"/>
+                    <w:ind w:left="283"/>
+                    <w:rPr>
+                      <w:rFonts w:ascii="Arial" w:hAnsi="Arial" w:cs="Arial"/>
+                      <w:sz w:val="18"/>
+                      <w:szCs w:val="18"/>
+                      <w:lang w:val="en-US"/>
+                    </w:rPr>
+                  </w:pPr>
+                  <w:r>
+                    <w:rPr>
+                      <w:rFonts w:ascii="Arial" w:hAnsi="Arial" w:cs="Arial"/>
+                      <w:sz w:val="18"/>
+                      <w:szCs w:val="18"/>
+                      <w:lang w:val="en-US"/>
+                    </w:rPr>
+                    <w:t>{Tokens_PAQPF_Champs_de_fusion_</w:t>
+                  </w:r>
+                  <w:proofErr w:type="gramStart"/>
+                  <w:r>
+                    <w:rPr>
+                      <w:rFonts w:ascii="Arial" w:hAnsi="Arial" w:cs="Arial"/>
+                      <w:sz w:val="18"/>
+                      <w:szCs w:val="18"/>
+                      <w:lang w:val="en-US"/>
+                    </w:rPr>
+                    <w:t>1.Contact</w:t>
+                  </w:r>
+                  <w:proofErr w:type="gramEnd"/>
+                  <w:r>
+                    <w:rPr>
+                      <w:rFonts w:ascii="Arial" w:hAnsi="Arial" w:cs="Arial"/>
+                      <w:sz w:val="18"/>
+                      <w:szCs w:val="18"/>
+                      <w:lang w:val="en-US"/>
+                    </w:rPr>
+                    <w:t>_RelationshipCache_Contact_</w:t>
+                  </w:r>
+                  <w:proofErr w:type="gramStart"/>
+                  <w:r>
+                    <w:rPr>
+                      <w:rFonts w:ascii="Arial" w:hAnsi="Arial" w:cs="Arial"/>
+                      <w:sz w:val="18"/>
+                      <w:szCs w:val="18"/>
+                      <w:lang w:val="en-US"/>
+                    </w:rPr>
+                    <w:t>01.postal</w:t>
+                  </w:r>
+                  <w:proofErr w:type="gramEnd"/>
+                  <w:r>
+                    <w:rPr>
+                      <w:rFonts w:ascii="Arial" w:hAnsi="Arial" w:cs="Arial"/>
+                      <w:sz w:val="18"/>
+                      <w:szCs w:val="18"/>
+                      <w:lang w:val="en-US"/>
+                    </w:rPr>
+                    <w:t>_greeting_</w:t>
+                  </w:r>
+                  <w:proofErr w:type="gramStart"/>
+                  <w:r>
+                    <w:rPr>
+                      <w:rFonts w:ascii="Arial" w:hAnsi="Arial" w:cs="Arial"/>
+                      <w:sz w:val="18"/>
+                      <w:szCs w:val="18"/>
+                      <w:lang w:val="en-US"/>
+                    </w:rPr>
+                    <w:t>id:label</w:t>
+                  </w:r>
+                  <w:proofErr w:type="gramEnd"/>
+                  <w:r>
+                    <w:rPr>
+                      <w:rFonts w:ascii="Arial" w:hAnsi="Arial" w:cs="Arial"/>
+                      <w:sz w:val="18"/>
+                      <w:szCs w:val="18"/>
+                      <w:lang w:val="en-US"/>
+                    </w:rPr>
+                    <w:t>}</w:t>
+                  </w:r>
+                  <w:proofErr w:type="gramStart"/>
+                  <w:r>
+                    <w:rPr>
+                      <w:rFonts w:ascii="Arial" w:hAnsi="Arial" w:cs="Arial"/>
+                      <w:sz w:val="18"/>
+                      <w:szCs w:val="18"/>
+                      <w:lang w:val="en-US"/>
+                    </w:rPr>
+                    <w:t xml:space="preserve"> </w:t>
+                  </w:r>
+                  <w:r>
+                    <w:rPr>
+                      <w:rFonts w:ascii="Arial" w:hAnsi="Arial" w:cs="Arial"/>
+                      <w:sz w:val="18"/>
+                      <w:szCs w:val="18"/>
+                      <w:lang w:val="en-US"/>
+                    </w:rPr>
+                    <w:t xml:space="preserve"> </w:t>
+                  </w:r>
+                  <w:r>
+                    <w:t xml:space="preserve"> </w:t>
+                  </w:r>
+                  <w:r>
+                    <w:rPr>
+                      <w:rFonts w:ascii="Arial" w:hAnsi="Arial" w:cs="Arial"/>
+                      <w:sz w:val="18"/>
+                      <w:szCs w:val="18"/>
+                      <w:lang w:val="en-US"/>
+                    </w:rPr>
+                    <w:t>{</w:t>
+                  </w:r>
+                  <w:proofErr w:type="gramEnd"/>
+                  <w:r>
+                    <w:rPr>
+                      <w:rFonts w:ascii="Arial" w:hAnsi="Arial" w:cs="Arial"/>
+                      <w:sz w:val="18"/>
+                      <w:szCs w:val="18"/>
+                      <w:lang w:val="en-US"/>
+                    </w:rPr>
+                    <w:t>Tokens_PAQPF_Champs_de_fusion_</w:t>
+                  </w:r>
+                  <w:proofErr w:type="gramStart"/>
+                  <w:r>
+                    <w:rPr>
+                      <w:rFonts w:ascii="Arial" w:hAnsi="Arial" w:cs="Arial"/>
+                      <w:sz w:val="18"/>
+                      <w:szCs w:val="18"/>
+                      <w:lang w:val="en-US"/>
+                    </w:rPr>
+                    <w:t>1.Contact</w:t>
+                  </w:r>
+                  <w:proofErr w:type="gramEnd"/>
+                  <w:r>
+                    <w:rPr>
+                      <w:rFonts w:ascii="Arial" w:hAnsi="Arial" w:cs="Arial"/>
+                      <w:sz w:val="18"/>
+                      <w:szCs w:val="18"/>
+                      <w:lang w:val="en-US"/>
+                    </w:rPr>
+                    <w:t>_RelationshipCache_Contact_</w:t>
+                  </w:r>
+                  <w:proofErr w:type="gramStart"/>
+                  <w:r>
+                    <w:rPr>
+                      <w:rFonts w:ascii="Arial" w:hAnsi="Arial" w:cs="Arial"/>
+                      <w:sz w:val="18"/>
+                      <w:szCs w:val="18"/>
+                      <w:lang w:val="en-US"/>
+                    </w:rPr>
+                    <w:t>01.first</w:t>
+                  </w:r>
+                  <w:proofErr w:type="gramEnd"/>
+                  <w:r>
+                    <w:rPr>
+                      <w:rFonts w:ascii="Arial" w:hAnsi="Arial" w:cs="Arial"/>
+                      <w:sz w:val="18"/>
+                      <w:szCs w:val="18"/>
+                      <w:lang w:val="en-US"/>
+                    </w:rPr>
+                    <w:t>_name}</w:t>
+                  </w:r>
+                  <w:r>
+                    <w:rPr>
+                      <w:rFonts w:ascii="Arial" w:hAnsi="Arial" w:cs="Arial"/>
+                      <w:sz w:val="18"/>
+                      <w:szCs w:val="18"/>
+                      <w:lang w:val="en-US"/>
+                    </w:rPr>
+                    <w:t xml:space="preserve"> </w:t>
+                  </w:r>
+                  <w:r>
+                    <w:rPr>
+                      <w:rFonts w:ascii="Arial" w:hAnsi="Arial" w:cs="Arial"/>
+                      <w:sz w:val="18"/>
+                      <w:szCs w:val="18"/>
+                      <w:lang w:val="en-US"/>
+                    </w:rPr>
+                    <w:t>{Tokens_PAQPF_Champs_de_fusion_</w:t>
+                  </w:r>
+                  <w:proofErr w:type="gramStart"/>
+                  <w:r>
+                    <w:rPr>
+                      <w:rFonts w:ascii="Arial" w:hAnsi="Arial" w:cs="Arial"/>
+                      <w:sz w:val="18"/>
+                      <w:szCs w:val="18"/>
+                      <w:lang w:val="en-US"/>
+                    </w:rPr>
+                    <w:t>1.CONCAT</w:t>
+                  </w:r>
+                  <w:proofErr w:type="gramEnd"/>
+                  <w:r>
+                    <w:rPr>
+                      <w:rFonts w:ascii="Arial" w:hAnsi="Arial" w:cs="Arial"/>
+                      <w:sz w:val="18"/>
+                      <w:szCs w:val="18"/>
+                      <w:lang w:val="en-US"/>
+                    </w:rPr>
+                    <w:t>_WS_Contact_RelationshipCache_Contact_01_last_name_Contact_RelationshipCache_Contact_01_nick_name}</w:t>
+                  </w:r>
+                </w:p>
+                <w:p>
+                  <w:pPr>
+                    <w:pStyle w:val="Contenudetableau"/>
+                    <w:ind w:left="283"/>
+                    <w:rPr>
+                      <w:rFonts w:ascii="Arial" w:hAnsi="Arial" w:cs="Arial"/>
+                      <w:sz w:val="18"/>
+                      <w:szCs w:val="18"/>
+                      <w:lang w:val="en-US"/>
+                    </w:rPr>
+                  </w:pPr>
+                  <w:r>
+                    <w:rPr>
+                      <w:rFonts w:ascii="Arial" w:hAnsi="Arial" w:cs="Arial"/>
+                      <w:sz w:val="18"/>
+                      <w:szCs w:val="18"/>
+                      <w:lang w:val="en-US"/>
+                    </w:rPr>
+                    <w:t>{Tokens_PAQPF_Champs_de_fusion_</w:t>
+                  </w:r>
+                  <w:proofErr w:type="gramStart"/>
+                  <w:r>
+                    <w:rPr>
+                      <w:rFonts w:ascii="Arial" w:hAnsi="Arial" w:cs="Arial"/>
+                      <w:sz w:val="18"/>
+                      <w:szCs w:val="18"/>
+                      <w:lang w:val="en-US"/>
+                    </w:rPr>
+                    <w:t>1.Contact</w:t>
+                  </w:r>
+                  <w:proofErr w:type="gramEnd"/>
+                  <w:r>
+                    <w:rPr>
+                      <w:rFonts w:ascii="Arial" w:hAnsi="Arial" w:cs="Arial"/>
+                      <w:sz w:val="18"/>
+                      <w:szCs w:val="18"/>
+                      <w:lang w:val="en-US"/>
+                    </w:rPr>
+                    <w:t>_RelationshipCache_Contact_</w:t>
+                  </w:r>
+                  <w:proofErr w:type="gramStart"/>
+                  <w:r>
+                    <w:rPr>
+                      <w:rFonts w:ascii="Arial" w:hAnsi="Arial" w:cs="Arial"/>
+                      <w:sz w:val="18"/>
+                      <w:szCs w:val="18"/>
+                      <w:lang w:val="en-US"/>
+                    </w:rPr>
+                    <w:t>01.address</w:t>
+                  </w:r>
+                  <w:proofErr w:type="gramEnd"/>
+                  <w:r>
+                    <w:rPr>
+                      <w:rFonts w:ascii="Arial" w:hAnsi="Arial" w:cs="Arial"/>
+                      <w:sz w:val="18"/>
+                      <w:szCs w:val="18"/>
+                      <w:lang w:val="en-US"/>
+                    </w:rPr>
+                    <w:t>_</w:t>
+                  </w:r>
+                  <w:proofErr w:type="gramStart"/>
+                  <w:r>
+                    <w:rPr>
+                      <w:rFonts w:ascii="Arial" w:hAnsi="Arial" w:cs="Arial"/>
+                      <w:sz w:val="18"/>
+                      <w:szCs w:val="18"/>
+                      <w:lang w:val="en-US"/>
+                    </w:rPr>
+                    <w:t>primary.street</w:t>
+                  </w:r>
+                  <w:proofErr w:type="gramEnd"/>
+                  <w:r>
+                    <w:rPr>
+                      <w:rFonts w:ascii="Arial" w:hAnsi="Arial" w:cs="Arial"/>
+                      <w:sz w:val="18"/>
+                      <w:szCs w:val="18"/>
+                      <w:lang w:val="en-US"/>
+                    </w:rPr>
+                    <w:t>_address}</w:t>
+                  </w:r>
+                </w:p>
+                <w:p>
+                  <w:pPr>
+                    <w:pStyle w:val="Contenudetableau"/>
+                    <w:ind w:left="283"/>
+                    <w:rPr>
+                      <w:rFonts w:ascii="Arial" w:hAnsi="Arial" w:cs="Arial"/>
+                      <w:sz w:val="18"/>
+                      <w:szCs w:val="18"/>
+                      <w:lang w:val="en-US"/>
+                    </w:rPr>
+                  </w:pPr>
+                  <w:r>
+                    <w:rPr>
+                      <w:rFonts w:ascii="Arial" w:hAnsi="Arial" w:cs="Arial"/>
+                      <w:sz w:val="18"/>
+                      <w:szCs w:val="18"/>
+                      <w:lang w:val="en-US"/>
+                    </w:rPr>
+                    <w:t>{Tokens_PAQPF_Champs_de_fusion_</w:t>
+                  </w:r>
+                  <w:proofErr w:type="gramStart"/>
+                  <w:r>
+                    <w:rPr>
+                      <w:rFonts w:ascii="Arial" w:hAnsi="Arial" w:cs="Arial"/>
+                      <w:sz w:val="18"/>
+                      <w:szCs w:val="18"/>
+                      <w:lang w:val="en-US"/>
+                    </w:rPr>
+                    <w:t>1.Contact</w:t>
+                  </w:r>
+                  <w:proofErr w:type="gramEnd"/>
+                  <w:r>
+                    <w:rPr>
+                      <w:rFonts w:ascii="Arial" w:hAnsi="Arial" w:cs="Arial"/>
+                      <w:sz w:val="18"/>
+                      <w:szCs w:val="18"/>
+                      <w:lang w:val="en-US"/>
+                    </w:rPr>
+                    <w:t>_RelationshipCache_Contact_</w:t>
+                  </w:r>
+                  <w:proofErr w:type="gramStart"/>
+                  <w:r>
+                    <w:rPr>
+                      <w:rFonts w:ascii="Arial" w:hAnsi="Arial" w:cs="Arial"/>
+                      <w:sz w:val="18"/>
+                      <w:szCs w:val="18"/>
+                      <w:lang w:val="en-US"/>
+                    </w:rPr>
+                    <w:t>01.address</w:t>
+                  </w:r>
+                  <w:proofErr w:type="gramEnd"/>
+                  <w:r>
+                    <w:rPr>
+                      <w:rFonts w:ascii="Arial" w:hAnsi="Arial" w:cs="Arial"/>
+                      <w:sz w:val="18"/>
+                      <w:szCs w:val="18"/>
+                      <w:lang w:val="en-US"/>
+                    </w:rPr>
+                    <w:t>_</w:t>
+                  </w:r>
+                  <w:proofErr w:type="gramStart"/>
+                  <w:r>
+                    <w:rPr>
+                      <w:rFonts w:ascii="Arial" w:hAnsi="Arial" w:cs="Arial"/>
+                      <w:sz w:val="18"/>
+                      <w:szCs w:val="18"/>
+                      <w:lang w:val="en-US"/>
+                    </w:rPr>
+                    <w:t>primary.supplemental</w:t>
+                  </w:r>
+                  <w:proofErr w:type="gramEnd"/>
+                  <w:r>
+                    <w:rPr>
+                      <w:rFonts w:ascii="Arial" w:hAnsi="Arial" w:cs="Arial"/>
+                      <w:sz w:val="18"/>
+                      <w:szCs w:val="18"/>
+                      <w:lang w:val="en-US"/>
+                    </w:rPr>
+                    <w:t>_address_1}</w:t>
+                  </w:r>
+                </w:p>
+                <w:p>
+                  <w:pPr>
+                    <w:pStyle w:val="Contenudetableau"/>
+                    <w:ind w:left="283"/>
+                    <w:rPr>
+                      <w:rFonts w:ascii="Arial" w:hAnsi="Arial" w:cs="Arial"/>
+                      <w:sz w:val="18"/>
+                      <w:szCs w:val="18"/>
+                      <w:lang w:val="en-US"/>
+                    </w:rPr>
+                  </w:pPr>
+                  <w:r>
+                    <w:rPr>
+                      <w:rFonts w:ascii="Arial" w:hAnsi="Arial" w:cs="Arial"/>
+                      <w:sz w:val="18"/>
+                      <w:szCs w:val="18"/>
+                      <w:lang w:val="en-US"/>
+                    </w:rPr>
+                    <w:t>{Tokens_PAQPF_Champs_de_fusion_</w:t>
+                  </w:r>
+                  <w:proofErr w:type="gramStart"/>
+                  <w:r>
+                    <w:rPr>
+                      <w:rFonts w:ascii="Arial" w:hAnsi="Arial" w:cs="Arial"/>
+                      <w:sz w:val="18"/>
+                      <w:szCs w:val="18"/>
+                      <w:lang w:val="en-US"/>
+                    </w:rPr>
+                    <w:t>1.Contact</w:t>
+                  </w:r>
+                  <w:proofErr w:type="gramEnd"/>
+                  <w:r>
+                    <w:rPr>
+                      <w:rFonts w:ascii="Arial" w:hAnsi="Arial" w:cs="Arial"/>
+                      <w:sz w:val="18"/>
+                      <w:szCs w:val="18"/>
+                      <w:lang w:val="en-US"/>
+                    </w:rPr>
+                    <w:t>_RelationshipCache_Contact_</w:t>
+                  </w:r>
+                  <w:proofErr w:type="gramStart"/>
+                  <w:r>
+                    <w:rPr>
+                      <w:rFonts w:ascii="Arial" w:hAnsi="Arial" w:cs="Arial"/>
+                      <w:sz w:val="18"/>
+                      <w:szCs w:val="18"/>
+                      <w:lang w:val="en-US"/>
+                    </w:rPr>
+                    <w:t>01.address</w:t>
+                  </w:r>
+                  <w:proofErr w:type="gramEnd"/>
+                  <w:r>
+                    <w:rPr>
+                      <w:rFonts w:ascii="Arial" w:hAnsi="Arial" w:cs="Arial"/>
+                      <w:sz w:val="18"/>
+                      <w:szCs w:val="18"/>
+                      <w:lang w:val="en-US"/>
+                    </w:rPr>
+                    <w:t>_</w:t>
+                  </w:r>
+                  <w:proofErr w:type="gramStart"/>
+                  <w:r>
+                    <w:rPr>
+                      <w:rFonts w:ascii="Arial" w:hAnsi="Arial" w:cs="Arial"/>
+                      <w:sz w:val="18"/>
+                      <w:szCs w:val="18"/>
+                      <w:lang w:val="en-US"/>
+                    </w:rPr>
+                    <w:t>primary.postal</w:t>
+                  </w:r>
+                  <w:proofErr w:type="gramEnd"/>
+                  <w:r>
+                    <w:rPr>
+                      <w:rFonts w:ascii="Arial" w:hAnsi="Arial" w:cs="Arial"/>
+                      <w:sz w:val="18"/>
+                      <w:szCs w:val="18"/>
+                      <w:lang w:val="en-US"/>
+                    </w:rPr>
+                    <w:t>_code}</w:t>
+                  </w:r>
+                  <w:r>
+                    <w:rPr>
+                      <w:rFonts w:ascii="Arial" w:hAnsi="Arial" w:cs="Arial"/>
+                      <w:sz w:val="18"/>
+                      <w:szCs w:val="18"/>
+                      <w:lang w:val="en-US"/>
+                    </w:rPr>
+                    <w:t xml:space="preserve"> </w:t>
+                  </w:r>
+                  <w:r>
+                    <w:rPr>
+                      <w:rFonts w:ascii="Arial" w:hAnsi="Arial" w:cs="Arial"/>
+                      <w:sz w:val="18"/>
+                      <w:szCs w:val="18"/>
+                      <w:lang w:val="en-US"/>
+                    </w:rPr>
+                    <w:t>{Tokens_PAQPF_Champs_de_fusion_</w:t>
+                  </w:r>
+                  <w:proofErr w:type="gramStart"/>
+                  <w:r>
+                    <w:rPr>
+                      <w:rFonts w:ascii="Arial" w:hAnsi="Arial" w:cs="Arial"/>
+                      <w:sz w:val="18"/>
+                      <w:szCs w:val="18"/>
+                      <w:lang w:val="en-US"/>
+                    </w:rPr>
+                    <w:t>1.Contact</w:t>
+                  </w:r>
+                  <w:proofErr w:type="gramEnd"/>
+                  <w:r>
+                    <w:rPr>
+                      <w:rFonts w:ascii="Arial" w:hAnsi="Arial" w:cs="Arial"/>
+                      <w:sz w:val="18"/>
+                      <w:szCs w:val="18"/>
+                      <w:lang w:val="en-US"/>
+                    </w:rPr>
+                    <w:t>_RelationshipCache_Contact_</w:t>
+                  </w:r>
+                  <w:proofErr w:type="gramStart"/>
+                  <w:r>
+                    <w:rPr>
+                      <w:rFonts w:ascii="Arial" w:hAnsi="Arial" w:cs="Arial"/>
+                      <w:sz w:val="18"/>
+                      <w:szCs w:val="18"/>
+                      <w:lang w:val="en-US"/>
+                    </w:rPr>
+                    <w:t>01.address</w:t>
+                  </w:r>
+                  <w:proofErr w:type="gramEnd"/>
+                  <w:r>
+                    <w:rPr>
+                      <w:rFonts w:ascii="Arial" w:hAnsi="Arial" w:cs="Arial"/>
+                      <w:sz w:val="18"/>
+                      <w:szCs w:val="18"/>
+                      <w:lang w:val="en-US"/>
+                    </w:rPr>
+                    <w:t>_</w:t>
+                  </w:r>
+                  <w:proofErr w:type="gramStart"/>
+                  <w:r>
+                    <w:rPr>
+                      <w:rFonts w:ascii="Arial" w:hAnsi="Arial" w:cs="Arial"/>
+                      <w:sz w:val="18"/>
+                      <w:szCs w:val="18"/>
+                      <w:lang w:val="en-US"/>
+                    </w:rPr>
+                    <w:t>primary.city</w:t>
+                  </w:r>
+                  <w:proofErr w:type="gramEnd"/>
+                  <w:r>
+                    <w:rPr>
+                      <w:rFonts w:ascii="Arial" w:hAnsi="Arial" w:cs="Arial"/>
+                      <w:sz w:val="18"/>
+                      <w:szCs w:val="18"/>
+                      <w:lang w:val="en-US"/>
+                    </w:rPr>
+                    <w:t>}</w:t>
+                  </w:r>
+                </w:p>
+                <w:p>
+                  <w:pPr>
+                    <w:pStyle w:val="Contenudetableau"/>
+                    <w:ind w:left="283"/>
+                    <w:rPr>
+                      <w:rFonts w:ascii="Arial" w:hAnsi="Arial" w:cs="Arial"/>
+                      <w:sz w:val="18"/>
+                      <w:szCs w:val="18"/>
+                      <w:lang w:val="en-US"/>
+                    </w:rPr>
+                  </w:pPr>
+                </w:p>
+              </w:tc>
+            </w:tr>
+          </w:tbl>
           <w:p>
             <w:pPr>
               <w:pStyle w:val="Contenudetableau"/>
@@ -860,56 +1013,35 @@
     <w:p>
       <w:pPr>
         <w:pStyle w:val="NormalWeb"/>
-        <w:spacing w:before="120" w:beforeAutospacing="0" w:after="0" w:afterAutospacing="0"/>
-        <w:rPr>
-          <w:rFonts w:ascii="Arial" w:hAnsi="Arial" w:cs="Arial"/>
-          <w:sz w:val="20"/>
-          <w:szCs w:val="20"/>
-        </w:rPr>
-      </w:pPr>
-      <w:r>
-        <w:rPr>
-          <w:rFonts w:ascii="Arial" w:hAnsi="Arial" w:cs="Arial"/>
-          <w:sz w:val="20"/>
-          <w:szCs w:val="20"/>
-        </w:rPr>
-        <w:t>{Tokens_PAQPF_Champs_de_fusion_</w:t>
-      </w:r>
-      <w:proofErr w:type="gramStart"/>
-      <w:r>
-        <w:rPr>
-          <w:rFonts w:ascii="Arial" w:hAnsi="Arial" w:cs="Arial"/>
-          <w:sz w:val="20"/>
-          <w:szCs w:val="20"/>
-        </w:rPr>
-        <w:t>1.Contact</w:t>
-      </w:r>
-      <w:proofErr w:type="gramEnd"/>
-      <w:r>
-        <w:rPr>
-          <w:rFonts w:ascii="Arial" w:hAnsi="Arial" w:cs="Arial"/>
-          <w:sz w:val="20"/>
-          <w:szCs w:val="20"/>
-        </w:rPr>
-        <w:t>_RelationshipCache_Contact_</w:t>
-      </w:r>
-      <w:proofErr w:type="gramStart"/>
-      <w:r>
-        <w:rPr>
-          <w:rFonts w:ascii="Arial" w:hAnsi="Arial" w:cs="Arial"/>
-          <w:sz w:val="20"/>
-          <w:szCs w:val="20"/>
-        </w:rPr>
-        <w:t>01.postal</w:t>
-      </w:r>
-      <w:proofErr w:type="gramEnd"/>
-      <w:r>
-        <w:rPr>
-          <w:rFonts w:ascii="Arial" w:hAnsi="Arial" w:cs="Arial"/>
-          <w:sz w:val="20"/>
-          <w:szCs w:val="20"/>
-        </w:rPr>
-        <w:t>_greeting_display}</w:t>
+        <w:rPr>
+          <w:rFonts w:ascii="Arial" w:hAnsi="Arial" w:cs="Arial"/>
+          <w:sz w:val="20"/>
+          <w:szCs w:val="20"/>
+        </w:rPr>
+      </w:pPr>
+      <w:r>
+        <w:rPr>
+          <w:rFonts w:ascii="Arial" w:hAnsi="Arial" w:cs="Arial"/>
+          <w:sz w:val="20"/>
+          <w:szCs w:val="20"/>
+        </w:rPr>
+        <w:t>{Tokens_PAQPF_Champs_de_fusion_1.Contact_RelationshipCache_Contact_01.postal_</w:t>
+      </w:r>
+      <w:r>
+        <w:rPr>
+          <w:rFonts w:ascii="Arial" w:hAnsi="Arial" w:cs="Arial"/>
+          <w:sz w:val="20"/>
+          <w:szCs w:val="20"/>
+        </w:rPr>
+        <w:t>greeting_id:label</w:t>
+      </w:r>
+      <w:r>
+        <w:rPr>
+          <w:rFonts w:ascii="Arial" w:hAnsi="Arial" w:cs="Arial"/>
+          <w:sz w:val="20"/>
+          <w:szCs w:val="20"/>
+        </w:rPr>
+        <w:t>}</w:t>
       </w:r>
       <w:r>
         <w:rPr>
@@ -1623,10 +1755,10 @@
                 <w:szCs w:val="20"/>
               </w:rPr>
               <w:drawing>
-                <wp:inline distT="0" distB="0" distL="0" distR="0" wp14:anchorId="26E5BFE7" wp14:editId="56FFD92F">
-                  <wp:extent cx="1855986" cy="816634"/>
-                  <wp:effectExtent l="0" t="0" r="0" b="0"/>
-                  <wp:docPr id="1009184800" name="Image 1"/>
+                <wp:inline distT="0" distB="0" distL="0" distR="0" wp14:anchorId="57CBC313" wp14:editId="79412DA2">
+                  <wp:extent cx="1772124" cy="532847"/>
+                  <wp:effectExtent l="0" t="0" r="6350" b="635"/>
+                  <wp:docPr id="2074606862" name="Image 1" descr="Une image contenant noir, obscurité&#10;&#10;Description générée automatiquement"/>
                   <wp:cNvGraphicFramePr>
                     <a:graphicFrameLocks xmlns:a="http://schemas.openxmlformats.org/drawingml/2006/main" noChangeAspect="1"/>
                   </wp:cNvGraphicFramePr>
@@ -1634,29 +1766,36 @@
                     <a:graphicData uri="http://schemas.openxmlformats.org/drawingml/2006/picture">
                       <pic:pic xmlns:pic="http://schemas.openxmlformats.org/drawingml/2006/picture">
                         <pic:nvPicPr>
-                          <pic:cNvPr id="1009184800" name="Image 1009184800"/>
-                          <pic:cNvPicPr/>
+                          <pic:cNvPr id="2074606862" name="Image 1" descr="Une image contenant noir, obscurité&#10;&#10;Description générée automatiquement"/>
+                          <pic:cNvPicPr>
+                            <a:picLocks noChangeAspect="1" noChangeArrowheads="1"/>
+                          </pic:cNvPicPr>
                         </pic:nvPicPr>
                         <pic:blipFill>
-                          <a:blip r:embed="rId9">
+                          <a:blip r:embed="rId9" cstate="print">
                             <a:extLst>
                               <a:ext uri="{28A0092B-C50C-407E-A947-70E740481C1C}">
                                 <a14:useLocalDpi xmlns:a14="http://schemas.microsoft.com/office/drawing/2010/main" val="0"/>
                               </a:ext>
                             </a:extLst>
                           </a:blip>
+                          <a:srcRect/>
                           <a:stretch>
                             <a:fillRect/>
                           </a:stretch>
                         </pic:blipFill>
-                        <pic:spPr>
+                        <pic:spPr bwMode="auto">
                           <a:xfrm>
                             <a:off x="0" y="0"/>
-                            <a:ext cx="1966926" cy="865448"/>
+                            <a:ext cx="1820514" cy="547397"/>
                           </a:xfrm>
                           <a:prstGeom prst="rect">
                             <a:avLst/>
                           </a:prstGeom>
+                          <a:noFill/>
+                          <a:ln>
+                            <a:noFill/>
+                          </a:ln>
                         </pic:spPr>
                       </pic:pic>
                     </a:graphicData>
@@ -1860,7 +1999,7 @@
 </file>
 
 <file path=word/endnotes.xml><?xml version="1.0" encoding="utf-8"?>
-<w:endnotes xmlns:wpc="http://schemas.microsoft.com/office/word/2010/wordprocessingCanvas" xmlns:cx="http://schemas.microsoft.com/office/drawing/2014/chartex" xmlns:cx1="http://schemas.microsoft.com/office/drawing/2015/9/8/chartex" xmlns:cx2="http://schemas.microsoft.com/office/drawing/2015/10/21/chartex" xmlns:cx3="http://schemas.microsoft.com/office/drawing/2016/5/9/chartex" xmlns:cx4="http://schemas.microsoft.com/office/drawing/2016/5/10/chartex" xmlns:cx5="http://schemas.microsoft.com/office/drawing/2016/5/11/chartex" xmlns:cx6="http://schemas.microsoft.com/office/drawing/2016/5/12/chartex" xmlns:cx7="http://schemas.microsoft.com/office/drawing/2016/5/13/chartex" xmlns:cx8="http://schemas.microsoft.com/office/drawing/2016/5/14/chartex" xmlns:mc="http://schemas.openxmlformats.org/markup-compatibility/2006" xmlns:aink="http://schemas.microsoft.com/office/drawing/2016/ink" xmlns:am3d="http://schemas.microsoft.com/office/drawing/2017/model3d" xmlns:o="urn:schemas-microsoft-com:office:office" xmlns:oel="http://schemas.microsoft.com/office/2019/extlst" xmlns:r="http://schemas.openxmlformats.org/officeDocument/2006/relationships" xmlns:m="http://schemas.openxmlformats.org/officeDocument/2006/math" xmlns:v="urn:schemas-microsoft-com:vml" xmlns:wp14="http://schemas.microsoft.com/office/word/2010/wordprocessingDrawing" xmlns:wp="http://schemas.openxmlformats.org/drawingml/2006/wordprocessingDrawing" xmlns:w10="urn:schemas-microsoft-com:office:word" xmlns:w="http://schemas.openxmlformats.org/wordprocessingml/2006/main" xmlns:w14="http://schemas.microsoft.com/office/word/2010/wordml" xmlns:w15="http://schemas.microsoft.com/office/word/2012/wordml" xmlns:w16cex="http://schemas.microsoft.com/office/word/2018/wordml/cex" xmlns:w16cid="http://schemas.microsoft.com/office/word/2016/wordml/cid" xmlns:w16="http://schemas.microsoft.com/office/word/2018/wordml" xmlns:w16du="http://schemas.microsoft.com/office/word/2023/wordml/word16du" xmlns:w16sdtdh="http://schemas.microsoft.com/office/word/2020/wordml/sdtdatahash" xmlns:w16sdtfl="http://schemas.microsoft.com/office/word/2024/wordml/sdtformatlock" xmlns:w16se="http://schemas.microsoft.com/office/word/2015/wordml/symex" xmlns:wpg="http://schemas.microsoft.com/office/word/2010/wordprocessingGroup" xmlns:wpi="http://schemas.microsoft.com/office/word/2010/wordprocessingInk" xmlns:wne="http://schemas.microsoft.com/office/word/2006/wordml" xmlns:wps="http://schemas.microsoft.com/office/word/2010/wordprocessingShape" mc:Ignorable="w14 w15 w16se w16cid w16 w16cex w16sdtdh w16sdtfl w16du wp14">
+<w:endnotes xmlns:wpc="http://schemas.microsoft.com/office/word/2010/wordprocessingCanvas" xmlns:cx="http://schemas.microsoft.com/office/drawing/2014/chartex" xmlns:cx1="http://schemas.microsoft.com/office/drawing/2015/9/8/chartex" xmlns:cx2="http://schemas.microsoft.com/office/drawing/2015/10/21/chartex" xmlns:cx3="http://schemas.microsoft.com/office/drawing/2016/5/9/chartex" xmlns:cx4="http://schemas.microsoft.com/office/drawing/2016/5/10/chartex" xmlns:cx5="http://schemas.microsoft.com/office/drawing/2016/5/11/chartex" xmlns:cx6="http://schemas.microsoft.com/office/drawing/2016/5/12/chartex" xmlns:cx7="http://schemas.microsoft.com/office/drawing/2016/5/13/chartex" xmlns:cx8="http://schemas.microsoft.com/office/drawing/2016/5/14/chartex" xmlns:mc="http://schemas.openxmlformats.org/markup-compatibility/2006" xmlns:m="http://schemas.openxmlformats.org/officeDocument/2006/math" xmlns:aink="http://schemas.microsoft.com/office/drawing/2016/ink" xmlns:am3d="http://schemas.microsoft.com/office/drawing/2017/model3d" xmlns:oel="http://schemas.microsoft.com/office/2019/extlst" xmlns:r="http://schemas.openxmlformats.org/officeDocument/2006/relationships" xmlns:wp14="http://schemas.microsoft.com/office/word/2010/wordprocessingDrawing" xmlns:wp="http://schemas.openxmlformats.org/drawingml/2006/wordprocessingDrawing" xmlns:wpg="http://schemas.microsoft.com/office/word/2010/wordprocessingGroup" xmlns:wpi="http://schemas.microsoft.com/office/word/2010/wordprocessingInk" xmlns:wps="http://schemas.microsoft.com/office/word/2010/wordprocessingShape" xmlns:o="urn:schemas-microsoft-com:office:office" xmlns:v="urn:schemas-microsoft-com:vml" xmlns:w10="urn:schemas-microsoft-com:office:word" xmlns:w="http://schemas.openxmlformats.org/wordprocessingml/2006/main" xmlns:w14="http://schemas.microsoft.com/office/word/2010/wordml" xmlns:w15="http://schemas.microsoft.com/office/word/2012/wordml" xmlns:w16cex="http://schemas.microsoft.com/office/word/2018/wordml/cex" xmlns:w16cid="http://schemas.microsoft.com/office/word/2016/wordml/cid" xmlns:w16="http://schemas.microsoft.com/office/word/2018/wordml" xmlns:w16sdtdh="http://schemas.microsoft.com/office/word/2020/wordml/sdtdatahash" xmlns:w16sdtfl="http://schemas.microsoft.com/office/word/2024/wordml/sdtformatlock" xmlns:w16se="http://schemas.microsoft.com/office/word/2015/wordml/symex" xmlns:w16du="http://schemas.microsoft.com/office/word/2023/wordml/word16du" xmlns:wne="http://schemas.microsoft.com/office/word/2006/wordml" mc:Ignorable="w14 w15 w16se w16cid w16 w16cex w16sdtdh w16sdtfl w16du wp14">
   <w:endnote w:type="separator" w:id="-1">
     <w:p>
       <w:r>
@@ -1879,7 +2018,7 @@
 </file>
 
 <file path=word/footer1.xml><?xml version="1.0" encoding="utf-8"?>
-<w:ftr xmlns:wpc="http://schemas.microsoft.com/office/word/2010/wordprocessingCanvas" xmlns:cx="http://schemas.microsoft.com/office/drawing/2014/chartex" xmlns:cx1="http://schemas.microsoft.com/office/drawing/2015/9/8/chartex" xmlns:cx2="http://schemas.microsoft.com/office/drawing/2015/10/21/chartex" xmlns:cx3="http://schemas.microsoft.com/office/drawing/2016/5/9/chartex" xmlns:cx4="http://schemas.microsoft.com/office/drawing/2016/5/10/chartex" xmlns:cx5="http://schemas.microsoft.com/office/drawing/2016/5/11/chartex" xmlns:cx6="http://schemas.microsoft.com/office/drawing/2016/5/12/chartex" xmlns:cx7="http://schemas.microsoft.com/office/drawing/2016/5/13/chartex" xmlns:cx8="http://schemas.microsoft.com/office/drawing/2016/5/14/chartex" xmlns:mc="http://schemas.openxmlformats.org/markup-compatibility/2006" xmlns:aink="http://schemas.microsoft.com/office/drawing/2016/ink" xmlns:am3d="http://schemas.microsoft.com/office/drawing/2017/model3d" xmlns:o="urn:schemas-microsoft-com:office:office" xmlns:oel="http://schemas.microsoft.com/office/2019/extlst" xmlns:r="http://schemas.openxmlformats.org/officeDocument/2006/relationships" xmlns:m="http://schemas.openxmlformats.org/officeDocument/2006/math" xmlns:v="urn:schemas-microsoft-com:vml" xmlns:wp14="http://schemas.microsoft.com/office/word/2010/wordprocessingDrawing" xmlns:wp="http://schemas.openxmlformats.org/drawingml/2006/wordprocessingDrawing" xmlns:w10="urn:schemas-microsoft-com:office:word" xmlns:w="http://schemas.openxmlformats.org/wordprocessingml/2006/main" xmlns:w14="http://schemas.microsoft.com/office/word/2010/wordml" xmlns:w15="http://schemas.microsoft.com/office/word/2012/wordml" xmlns:w16cex="http://schemas.microsoft.com/office/word/2018/wordml/cex" xmlns:w16cid="http://schemas.microsoft.com/office/word/2016/wordml/cid" xmlns:w16="http://schemas.microsoft.com/office/word/2018/wordml" xmlns:w16du="http://schemas.microsoft.com/office/word/2023/wordml/word16du" xmlns:w16sdtdh="http://schemas.microsoft.com/office/word/2020/wordml/sdtdatahash" xmlns:w16sdtfl="http://schemas.microsoft.com/office/word/2024/wordml/sdtformatlock" xmlns:w16se="http://schemas.microsoft.com/office/word/2015/wordml/symex" xmlns:wpg="http://schemas.microsoft.com/office/word/2010/wordprocessingGroup" xmlns:wpi="http://schemas.microsoft.com/office/word/2010/wordprocessingInk" xmlns:wne="http://schemas.microsoft.com/office/word/2006/wordml" xmlns:wps="http://schemas.microsoft.com/office/word/2010/wordprocessingShape" mc:Ignorable="w14 w15 w16se w16cid w16 w16cex w16sdtdh w16sdtfl w16du wp14">
+<w:ftr xmlns:wpc="http://schemas.microsoft.com/office/word/2010/wordprocessingCanvas" xmlns:cx="http://schemas.microsoft.com/office/drawing/2014/chartex" xmlns:cx1="http://schemas.microsoft.com/office/drawing/2015/9/8/chartex" xmlns:cx2="http://schemas.microsoft.com/office/drawing/2015/10/21/chartex" xmlns:cx3="http://schemas.microsoft.com/office/drawing/2016/5/9/chartex" xmlns:cx4="http://schemas.microsoft.com/office/drawing/2016/5/10/chartex" xmlns:cx5="http://schemas.microsoft.com/office/drawing/2016/5/11/chartex" xmlns:cx6="http://schemas.microsoft.com/office/drawing/2016/5/12/chartex" xmlns:cx7="http://schemas.microsoft.com/office/drawing/2016/5/13/chartex" xmlns:cx8="http://schemas.microsoft.com/office/drawing/2016/5/14/chartex" xmlns:mc="http://schemas.openxmlformats.org/markup-compatibility/2006" xmlns:m="http://schemas.openxmlformats.org/officeDocument/2006/math" xmlns:aink="http://schemas.microsoft.com/office/drawing/2016/ink" xmlns:am3d="http://schemas.microsoft.com/office/drawing/2017/model3d" xmlns:oel="http://schemas.microsoft.com/office/2019/extlst" xmlns:r="http://schemas.openxmlformats.org/officeDocument/2006/relationships" xmlns:wp14="http://schemas.microsoft.com/office/word/2010/wordprocessingDrawing" xmlns:wp="http://schemas.openxmlformats.org/drawingml/2006/wordprocessingDrawing" xmlns:wpg="http://schemas.microsoft.com/office/word/2010/wordprocessingGroup" xmlns:wpi="http://schemas.microsoft.com/office/word/2010/wordprocessingInk" xmlns:wps="http://schemas.microsoft.com/office/word/2010/wordprocessingShape" xmlns:o="urn:schemas-microsoft-com:office:office" xmlns:v="urn:schemas-microsoft-com:vml" xmlns:w10="urn:schemas-microsoft-com:office:word" xmlns:w="http://schemas.openxmlformats.org/wordprocessingml/2006/main" xmlns:w14="http://schemas.microsoft.com/office/word/2010/wordml" xmlns:w15="http://schemas.microsoft.com/office/word/2012/wordml" xmlns:w16cex="http://schemas.microsoft.com/office/word/2018/wordml/cex" xmlns:w16cid="http://schemas.microsoft.com/office/word/2016/wordml/cid" xmlns:w16="http://schemas.microsoft.com/office/word/2018/wordml" xmlns:w16sdtdh="http://schemas.microsoft.com/office/word/2020/wordml/sdtdatahash" xmlns:w16sdtfl="http://schemas.microsoft.com/office/word/2024/wordml/sdtformatlock" xmlns:w16se="http://schemas.microsoft.com/office/word/2015/wordml/symex" xmlns:w16du="http://schemas.microsoft.com/office/word/2023/wordml/word16du" xmlns:wne="http://schemas.microsoft.com/office/word/2006/wordml" mc:Ignorable="w14 w15 w16se w16cid w16 w16cex w16sdtdh w16sdtfl w16du wp14">
   <w:p>
     <w:pPr>
       <w:pStyle w:val="Pieddepage"/>
@@ -1889,7 +2028,7 @@
 </file>
 
 <file path=word/footer2.xml><?xml version="1.0" encoding="utf-8"?>
-<w:ftr xmlns:wpc="http://schemas.microsoft.com/office/word/2010/wordprocessingCanvas" xmlns:cx="http://schemas.microsoft.com/office/drawing/2014/chartex" xmlns:cx1="http://schemas.microsoft.com/office/drawing/2015/9/8/chartex" xmlns:cx2="http://schemas.microsoft.com/office/drawing/2015/10/21/chartex" xmlns:cx3="http://schemas.microsoft.com/office/drawing/2016/5/9/chartex" xmlns:cx4="http://schemas.microsoft.com/office/drawing/2016/5/10/chartex" xmlns:cx5="http://schemas.microsoft.com/office/drawing/2016/5/11/chartex" xmlns:cx6="http://schemas.microsoft.com/office/drawing/2016/5/12/chartex" xmlns:cx7="http://schemas.microsoft.com/office/drawing/2016/5/13/chartex" xmlns:cx8="http://schemas.microsoft.com/office/drawing/2016/5/14/chartex" xmlns:mc="http://schemas.openxmlformats.org/markup-compatibility/2006" xmlns:aink="http://schemas.microsoft.com/office/drawing/2016/ink" xmlns:am3d="http://schemas.microsoft.com/office/drawing/2017/model3d" xmlns:o="urn:schemas-microsoft-com:office:office" xmlns:oel="http://schemas.microsoft.com/office/2019/extlst" xmlns:r="http://schemas.openxmlformats.org/officeDocument/2006/relationships" xmlns:m="http://schemas.openxmlformats.org/officeDocument/2006/math" xmlns:v="urn:schemas-microsoft-com:vml" xmlns:wp14="http://schemas.microsoft.com/office/word/2010/wordprocessingDrawing" xmlns:wp="http://schemas.openxmlformats.org/drawingml/2006/wordprocessingDrawing" xmlns:w10="urn:schemas-microsoft-com:office:word" xmlns:w="http://schemas.openxmlformats.org/wordprocessingml/2006/main" xmlns:w14="http://schemas.microsoft.com/office/word/2010/wordml" xmlns:w15="http://schemas.microsoft.com/office/word/2012/wordml" xmlns:w16cex="http://schemas.microsoft.com/office/word/2018/wordml/cex" xmlns:w16cid="http://schemas.microsoft.com/office/word/2016/wordml/cid" xmlns:w16="http://schemas.microsoft.com/office/word/2018/wordml" xmlns:w16du="http://schemas.microsoft.com/office/word/2023/wordml/word16du" xmlns:w16sdtdh="http://schemas.microsoft.com/office/word/2020/wordml/sdtdatahash" xmlns:w16sdtfl="http://schemas.microsoft.com/office/word/2024/wordml/sdtformatlock" xmlns:w16se="http://schemas.microsoft.com/office/word/2015/wordml/symex" xmlns:wpg="http://schemas.microsoft.com/office/word/2010/wordprocessingGroup" xmlns:wpi="http://schemas.microsoft.com/office/word/2010/wordprocessingInk" xmlns:wne="http://schemas.microsoft.com/office/word/2006/wordml" xmlns:wps="http://schemas.microsoft.com/office/word/2010/wordprocessingShape" mc:Ignorable="w14 w15 w16se w16cid w16 w16cex w16sdtdh w16sdtfl w16du wp14">
+<w:ftr xmlns:wpc="http://schemas.microsoft.com/office/word/2010/wordprocessingCanvas" xmlns:cx="http://schemas.microsoft.com/office/drawing/2014/chartex" xmlns:cx1="http://schemas.microsoft.com/office/drawing/2015/9/8/chartex" xmlns:cx2="http://schemas.microsoft.com/office/drawing/2015/10/21/chartex" xmlns:cx3="http://schemas.microsoft.com/office/drawing/2016/5/9/chartex" xmlns:cx4="http://schemas.microsoft.com/office/drawing/2016/5/10/chartex" xmlns:cx5="http://schemas.microsoft.com/office/drawing/2016/5/11/chartex" xmlns:cx6="http://schemas.microsoft.com/office/drawing/2016/5/12/chartex" xmlns:cx7="http://schemas.microsoft.com/office/drawing/2016/5/13/chartex" xmlns:cx8="http://schemas.microsoft.com/office/drawing/2016/5/14/chartex" xmlns:mc="http://schemas.openxmlformats.org/markup-compatibility/2006" xmlns:m="http://schemas.openxmlformats.org/officeDocument/2006/math" xmlns:aink="http://schemas.microsoft.com/office/drawing/2016/ink" xmlns:am3d="http://schemas.microsoft.com/office/drawing/2017/model3d" xmlns:oel="http://schemas.microsoft.com/office/2019/extlst" xmlns:r="http://schemas.openxmlformats.org/officeDocument/2006/relationships" xmlns:wp14="http://schemas.microsoft.com/office/word/2010/wordprocessingDrawing" xmlns:wp="http://schemas.openxmlformats.org/drawingml/2006/wordprocessingDrawing" xmlns:wpg="http://schemas.microsoft.com/office/word/2010/wordprocessingGroup" xmlns:wpi="http://schemas.microsoft.com/office/word/2010/wordprocessingInk" xmlns:wps="http://schemas.microsoft.com/office/word/2010/wordprocessingShape" xmlns:o="urn:schemas-microsoft-com:office:office" xmlns:v="urn:schemas-microsoft-com:vml" xmlns:w10="urn:schemas-microsoft-com:office:word" xmlns:w="http://schemas.openxmlformats.org/wordprocessingml/2006/main" xmlns:w14="http://schemas.microsoft.com/office/word/2010/wordml" xmlns:w15="http://schemas.microsoft.com/office/word/2012/wordml" xmlns:w16cex="http://schemas.microsoft.com/office/word/2018/wordml/cex" xmlns:w16cid="http://schemas.microsoft.com/office/word/2016/wordml/cid" xmlns:w16="http://schemas.microsoft.com/office/word/2018/wordml" xmlns:w16sdtdh="http://schemas.microsoft.com/office/word/2020/wordml/sdtdatahash" xmlns:w16sdtfl="http://schemas.microsoft.com/office/word/2024/wordml/sdtformatlock" xmlns:w16se="http://schemas.microsoft.com/office/word/2015/wordml/symex" xmlns:w16du="http://schemas.microsoft.com/office/word/2023/wordml/word16du" xmlns:wne="http://schemas.microsoft.com/office/word/2006/wordml" mc:Ignorable="w14 w15 w16se w16cid w16 w16cex w16sdtdh w16sdtfl w16du wp14">
   <w:p>
     <w:pPr>
       <w:pStyle w:val="ADRESSEpieddepage"/>
@@ -1899,7 +2038,7 @@
 </file>
 
 <file path=word/footer3.xml><?xml version="1.0" encoding="utf-8"?>
-<w:ftr xmlns:wpc="http://schemas.microsoft.com/office/word/2010/wordprocessingCanvas" xmlns:cx="http://schemas.microsoft.com/office/drawing/2014/chartex" xmlns:cx1="http://schemas.microsoft.com/office/drawing/2015/9/8/chartex" xmlns:cx2="http://schemas.microsoft.com/office/drawing/2015/10/21/chartex" xmlns:cx3="http://schemas.microsoft.com/office/drawing/2016/5/9/chartex" xmlns:cx4="http://schemas.microsoft.com/office/drawing/2016/5/10/chartex" xmlns:cx5="http://schemas.microsoft.com/office/drawing/2016/5/11/chartex" xmlns:cx6="http://schemas.microsoft.com/office/drawing/2016/5/12/chartex" xmlns:cx7="http://schemas.microsoft.com/office/drawing/2016/5/13/chartex" xmlns:cx8="http://schemas.microsoft.com/office/drawing/2016/5/14/chartex" xmlns:mc="http://schemas.openxmlformats.org/markup-compatibility/2006" xmlns:aink="http://schemas.microsoft.com/office/drawing/2016/ink" xmlns:am3d="http://schemas.microsoft.com/office/drawing/2017/model3d" xmlns:o="urn:schemas-microsoft-com:office:office" xmlns:oel="http://schemas.microsoft.com/office/2019/extlst" xmlns:r="http://schemas.openxmlformats.org/officeDocument/2006/relationships" xmlns:m="http://schemas.openxmlformats.org/officeDocument/2006/math" xmlns:v="urn:schemas-microsoft-com:vml" xmlns:wp14="http://schemas.microsoft.com/office/word/2010/wordprocessingDrawing" xmlns:wp="http://schemas.openxmlformats.org/drawingml/2006/wordprocessingDrawing" xmlns:w10="urn:schemas-microsoft-com:office:word" xmlns:w="http://schemas.openxmlformats.org/wordprocessingml/2006/main" xmlns:w14="http://schemas.microsoft.com/office/word/2010/wordml" xmlns:w15="http://schemas.microsoft.com/office/word/2012/wordml" xmlns:w16cex="http://schemas.microsoft.com/office/word/2018/wordml/cex" xmlns:w16cid="http://schemas.microsoft.com/office/word/2016/wordml/cid" xmlns:w16="http://schemas.microsoft.com/office/word/2018/wordml" xmlns:w16du="http://schemas.microsoft.com/office/word/2023/wordml/word16du" xmlns:w16sdtdh="http://schemas.microsoft.com/office/word/2020/wordml/sdtdatahash" xmlns:w16sdtfl="http://schemas.microsoft.com/office/word/2024/wordml/sdtformatlock" xmlns:w16se="http://schemas.microsoft.com/office/word/2015/wordml/symex" xmlns:wpg="http://schemas.microsoft.com/office/word/2010/wordprocessingGroup" xmlns:wpi="http://schemas.microsoft.com/office/word/2010/wordprocessingInk" xmlns:wne="http://schemas.microsoft.com/office/word/2006/wordml" xmlns:wps="http://schemas.microsoft.com/office/word/2010/wordprocessingShape" mc:Ignorable="w14 w15 w16se w16cid w16 w16cex w16sdtdh w16sdtfl w16du wp14">
+<w:ftr xmlns:wpc="http://schemas.microsoft.com/office/word/2010/wordprocessingCanvas" xmlns:cx="http://schemas.microsoft.com/office/drawing/2014/chartex" xmlns:cx1="http://schemas.microsoft.com/office/drawing/2015/9/8/chartex" xmlns:cx2="http://schemas.microsoft.com/office/drawing/2015/10/21/chartex" xmlns:cx3="http://schemas.microsoft.com/office/drawing/2016/5/9/chartex" xmlns:cx4="http://schemas.microsoft.com/office/drawing/2016/5/10/chartex" xmlns:cx5="http://schemas.microsoft.com/office/drawing/2016/5/11/chartex" xmlns:cx6="http://schemas.microsoft.com/office/drawing/2016/5/12/chartex" xmlns:cx7="http://schemas.microsoft.com/office/drawing/2016/5/13/chartex" xmlns:cx8="http://schemas.microsoft.com/office/drawing/2016/5/14/chartex" xmlns:mc="http://schemas.openxmlformats.org/markup-compatibility/2006" xmlns:m="http://schemas.openxmlformats.org/officeDocument/2006/math" xmlns:aink="http://schemas.microsoft.com/office/drawing/2016/ink" xmlns:am3d="http://schemas.microsoft.com/office/drawing/2017/model3d" xmlns:oel="http://schemas.microsoft.com/office/2019/extlst" xmlns:r="http://schemas.openxmlformats.org/officeDocument/2006/relationships" xmlns:wp14="http://schemas.microsoft.com/office/word/2010/wordprocessingDrawing" xmlns:wp="http://schemas.openxmlformats.org/drawingml/2006/wordprocessingDrawing" xmlns:wpg="http://schemas.microsoft.com/office/word/2010/wordprocessingGroup" xmlns:wpi="http://schemas.microsoft.com/office/word/2010/wordprocessingInk" xmlns:wps="http://schemas.microsoft.com/office/word/2010/wordprocessingShape" xmlns:o="urn:schemas-microsoft-com:office:office" xmlns:v="urn:schemas-microsoft-com:vml" xmlns:w10="urn:schemas-microsoft-com:office:word" xmlns:w="http://schemas.openxmlformats.org/wordprocessingml/2006/main" xmlns:w14="http://schemas.microsoft.com/office/word/2010/wordml" xmlns:w15="http://schemas.microsoft.com/office/word/2012/wordml" xmlns:w16cex="http://schemas.microsoft.com/office/word/2018/wordml/cex" xmlns:w16cid="http://schemas.microsoft.com/office/word/2016/wordml/cid" xmlns:w16="http://schemas.microsoft.com/office/word/2018/wordml" xmlns:w16sdtdh="http://schemas.microsoft.com/office/word/2020/wordml/sdtdatahash" xmlns:w16sdtfl="http://schemas.microsoft.com/office/word/2024/wordml/sdtformatlock" xmlns:w16se="http://schemas.microsoft.com/office/word/2015/wordml/symex" xmlns:w16du="http://schemas.microsoft.com/office/word/2023/wordml/word16du" xmlns:wne="http://schemas.microsoft.com/office/word/2006/wordml" mc:Ignorable="w14 w15 w16se w16cid w16 w16cex w16sdtdh w16sdtfl w16du wp14">
   <w:p>
     <w:pPr>
       <w:pStyle w:val="ADRESSEpieddepage"/>
@@ -1912,7 +2051,7 @@
 </file>
 
 <file path=word/footnotes.xml><?xml version="1.0" encoding="utf-8"?>
-<w:footnotes xmlns:wpc="http://schemas.microsoft.com/office/word/2010/wordprocessingCanvas" xmlns:cx="http://schemas.microsoft.com/office/drawing/2014/chartex" xmlns:cx1="http://schemas.microsoft.com/office/drawing/2015/9/8/chartex" xmlns:cx2="http://schemas.microsoft.com/office/drawing/2015/10/21/chartex" xmlns:cx3="http://schemas.microsoft.com/office/drawing/2016/5/9/chartex" xmlns:cx4="http://schemas.microsoft.com/office/drawing/2016/5/10/chartex" xmlns:cx5="http://schemas.microsoft.com/office/drawing/2016/5/11/chartex" xmlns:cx6="http://schemas.microsoft.com/office/drawing/2016/5/12/chartex" xmlns:cx7="http://schemas.microsoft.com/office/drawing/2016/5/13/chartex" xmlns:cx8="http://schemas.microsoft.com/office/drawing/2016/5/14/chartex" xmlns:mc="http://schemas.openxmlformats.org/markup-compatibility/2006" xmlns:aink="http://schemas.microsoft.com/office/drawing/2016/ink" xmlns:am3d="http://schemas.microsoft.com/office/drawing/2017/model3d" xmlns:o="urn:schemas-microsoft-com:office:office" xmlns:oel="http://schemas.microsoft.com/office/2019/extlst" xmlns:r="http://schemas.openxmlformats.org/officeDocument/2006/relationships" xmlns:m="http://schemas.openxmlformats.org/officeDocument/2006/math" xmlns:v="urn:schemas-microsoft-com:vml" xmlns:wp14="http://schemas.microsoft.com/office/word/2010/wordprocessingDrawing" xmlns:wp="http://schemas.openxmlformats.org/drawingml/2006/wordprocessingDrawing" xmlns:w10="urn:schemas-microsoft-com:office:word" xmlns:w="http://schemas.openxmlformats.org/wordprocessingml/2006/main" xmlns:w14="http://schemas.microsoft.com/office/word/2010/wordml" xmlns:w15="http://schemas.microsoft.com/office/word/2012/wordml" xmlns:w16cex="http://schemas.microsoft.com/office/word/2018/wordml/cex" xmlns:w16cid="http://schemas.microsoft.com/office/word/2016/wordml/cid" xmlns:w16="http://schemas.microsoft.com/office/word/2018/wordml" xmlns:w16du="http://schemas.microsoft.com/office/word/2023/wordml/word16du" xmlns:w16sdtdh="http://schemas.microsoft.com/office/word/2020/wordml/sdtdatahash" xmlns:w16sdtfl="http://schemas.microsoft.com/office/word/2024/wordml/sdtformatlock" xmlns:w16se="http://schemas.microsoft.com/office/word/2015/wordml/symex" xmlns:wpg="http://schemas.microsoft.com/office/word/2010/wordprocessingGroup" xmlns:wpi="http://schemas.microsoft.com/office/word/2010/wordprocessingInk" xmlns:wne="http://schemas.microsoft.com/office/word/2006/wordml" xmlns:wps="http://schemas.microsoft.com/office/word/2010/wordprocessingShape" mc:Ignorable="w14 w15 w16se w16cid w16 w16cex w16sdtdh w16sdtfl w16du wp14">
+<w:footnotes xmlns:wpc="http://schemas.microsoft.com/office/word/2010/wordprocessingCanvas" xmlns:cx="http://schemas.microsoft.com/office/drawing/2014/chartex" xmlns:cx1="http://schemas.microsoft.com/office/drawing/2015/9/8/chartex" xmlns:cx2="http://schemas.microsoft.com/office/drawing/2015/10/21/chartex" xmlns:cx3="http://schemas.microsoft.com/office/drawing/2016/5/9/chartex" xmlns:cx4="http://schemas.microsoft.com/office/drawing/2016/5/10/chartex" xmlns:cx5="http://schemas.microsoft.com/office/drawing/2016/5/11/chartex" xmlns:cx6="http://schemas.microsoft.com/office/drawing/2016/5/12/chartex" xmlns:cx7="http://schemas.microsoft.com/office/drawing/2016/5/13/chartex" xmlns:cx8="http://schemas.microsoft.com/office/drawing/2016/5/14/chartex" xmlns:mc="http://schemas.openxmlformats.org/markup-compatibility/2006" xmlns:m="http://schemas.openxmlformats.org/officeDocument/2006/math" xmlns:aink="http://schemas.microsoft.com/office/drawing/2016/ink" xmlns:am3d="http://schemas.microsoft.com/office/drawing/2017/model3d" xmlns:oel="http://schemas.microsoft.com/office/2019/extlst" xmlns:r="http://schemas.openxmlformats.org/officeDocument/2006/relationships" xmlns:wp14="http://schemas.microsoft.com/office/word/2010/wordprocessingDrawing" xmlns:wp="http://schemas.openxmlformats.org/drawingml/2006/wordprocessingDrawing" xmlns:wpg="http://schemas.microsoft.com/office/word/2010/wordprocessingGroup" xmlns:wpi="http://schemas.microsoft.com/office/word/2010/wordprocessingInk" xmlns:wps="http://schemas.microsoft.com/office/word/2010/wordprocessingShape" xmlns:o="urn:schemas-microsoft-com:office:office" xmlns:v="urn:schemas-microsoft-com:vml" xmlns:w10="urn:schemas-microsoft-com:office:word" xmlns:w="http://schemas.openxmlformats.org/wordprocessingml/2006/main" xmlns:w14="http://schemas.microsoft.com/office/word/2010/wordml" xmlns:w15="http://schemas.microsoft.com/office/word/2012/wordml" xmlns:w16cex="http://schemas.microsoft.com/office/word/2018/wordml/cex" xmlns:w16cid="http://schemas.microsoft.com/office/word/2016/wordml/cid" xmlns:w16="http://schemas.microsoft.com/office/word/2018/wordml" xmlns:w16sdtdh="http://schemas.microsoft.com/office/word/2020/wordml/sdtdatahash" xmlns:w16sdtfl="http://schemas.microsoft.com/office/word/2024/wordml/sdtformatlock" xmlns:w16se="http://schemas.microsoft.com/office/word/2015/wordml/symex" xmlns:w16du="http://schemas.microsoft.com/office/word/2023/wordml/word16du" xmlns:wne="http://schemas.microsoft.com/office/word/2006/wordml" mc:Ignorable="w14 w15 w16se w16cid w16 w16cex w16sdtdh w16sdtfl w16du wp14">
   <w:footnote w:type="separator" w:id="-1">
     <w:p>
       <w:r>
@@ -1931,7 +2070,7 @@
 </file>
 
 <file path=word/header1.xml><?xml version="1.0" encoding="utf-8"?>
-<w:hdr xmlns:wpc="http://schemas.microsoft.com/office/word/2010/wordprocessingCanvas" xmlns:cx="http://schemas.microsoft.com/office/drawing/2014/chartex" xmlns:cx1="http://schemas.microsoft.com/office/drawing/2015/9/8/chartex" xmlns:cx2="http://schemas.microsoft.com/office/drawing/2015/10/21/chartex" xmlns:cx3="http://schemas.microsoft.com/office/drawing/2016/5/9/chartex" xmlns:cx4="http://schemas.microsoft.com/office/drawing/2016/5/10/chartex" xmlns:cx5="http://schemas.microsoft.com/office/drawing/2016/5/11/chartex" xmlns:cx6="http://schemas.microsoft.com/office/drawing/2016/5/12/chartex" xmlns:cx7="http://schemas.microsoft.com/office/drawing/2016/5/13/chartex" xmlns:cx8="http://schemas.microsoft.com/office/drawing/2016/5/14/chartex" xmlns:mc="http://schemas.openxmlformats.org/markup-compatibility/2006" xmlns:aink="http://schemas.microsoft.com/office/drawing/2016/ink" xmlns:am3d="http://schemas.microsoft.com/office/drawing/2017/model3d" xmlns:o="urn:schemas-microsoft-com:office:office" xmlns:oel="http://schemas.microsoft.com/office/2019/extlst" xmlns:r="http://schemas.openxmlformats.org/officeDocument/2006/relationships" xmlns:m="http://schemas.openxmlformats.org/officeDocument/2006/math" xmlns:v="urn:schemas-microsoft-com:vml" xmlns:wp14="http://schemas.microsoft.com/office/word/2010/wordprocessingDrawing" xmlns:wp="http://schemas.openxmlformats.org/drawingml/2006/wordprocessingDrawing" xmlns:w10="urn:schemas-microsoft-com:office:word" xmlns:w="http://schemas.openxmlformats.org/wordprocessingml/2006/main" xmlns:w14="http://schemas.microsoft.com/office/word/2010/wordml" xmlns:w15="http://schemas.microsoft.com/office/word/2012/wordml" xmlns:w16cex="http://schemas.microsoft.com/office/word/2018/wordml/cex" xmlns:w16cid="http://schemas.microsoft.com/office/word/2016/wordml/cid" xmlns:w16="http://schemas.microsoft.com/office/word/2018/wordml" xmlns:w16du="http://schemas.microsoft.com/office/word/2023/wordml/word16du" xmlns:w16sdtdh="http://schemas.microsoft.com/office/word/2020/wordml/sdtdatahash" xmlns:w16sdtfl="http://schemas.microsoft.com/office/word/2024/wordml/sdtformatlock" xmlns:w16se="http://schemas.microsoft.com/office/word/2015/wordml/symex" xmlns:wpg="http://schemas.microsoft.com/office/word/2010/wordprocessingGroup" xmlns:wpi="http://schemas.microsoft.com/office/word/2010/wordprocessingInk" xmlns:wne="http://schemas.microsoft.com/office/word/2006/wordml" xmlns:wps="http://schemas.microsoft.com/office/word/2010/wordprocessingShape" mc:Ignorable="w14 w15 w16se w16cid w16 w16cex w16sdtdh w16sdtfl w16du wp14">
+<w:hdr xmlns:wpc="http://schemas.microsoft.com/office/word/2010/wordprocessingCanvas" xmlns:cx="http://schemas.microsoft.com/office/drawing/2014/chartex" xmlns:cx1="http://schemas.microsoft.com/office/drawing/2015/9/8/chartex" xmlns:cx2="http://schemas.microsoft.com/office/drawing/2015/10/21/chartex" xmlns:cx3="http://schemas.microsoft.com/office/drawing/2016/5/9/chartex" xmlns:cx4="http://schemas.microsoft.com/office/drawing/2016/5/10/chartex" xmlns:cx5="http://schemas.microsoft.com/office/drawing/2016/5/11/chartex" xmlns:cx6="http://schemas.microsoft.com/office/drawing/2016/5/12/chartex" xmlns:cx7="http://schemas.microsoft.com/office/drawing/2016/5/13/chartex" xmlns:cx8="http://schemas.microsoft.com/office/drawing/2016/5/14/chartex" xmlns:mc="http://schemas.openxmlformats.org/markup-compatibility/2006" xmlns:m="http://schemas.openxmlformats.org/officeDocument/2006/math" xmlns:aink="http://schemas.microsoft.com/office/drawing/2016/ink" xmlns:am3d="http://schemas.microsoft.com/office/drawing/2017/model3d" xmlns:oel="http://schemas.microsoft.com/office/2019/extlst" xmlns:r="http://schemas.openxmlformats.org/officeDocument/2006/relationships" xmlns:wp14="http://schemas.microsoft.com/office/word/2010/wordprocessingDrawing" xmlns:wp="http://schemas.openxmlformats.org/drawingml/2006/wordprocessingDrawing" xmlns:wpg="http://schemas.microsoft.com/office/word/2010/wordprocessingGroup" xmlns:wpi="http://schemas.microsoft.com/office/word/2010/wordprocessingInk" xmlns:wps="http://schemas.microsoft.com/office/word/2010/wordprocessingShape" xmlns:o="urn:schemas-microsoft-com:office:office" xmlns:v="urn:schemas-microsoft-com:vml" xmlns:w10="urn:schemas-microsoft-com:office:word" xmlns:w="http://schemas.openxmlformats.org/wordprocessingml/2006/main" xmlns:w14="http://schemas.microsoft.com/office/word/2010/wordml" xmlns:w15="http://schemas.microsoft.com/office/word/2012/wordml" xmlns:w16cex="http://schemas.microsoft.com/office/word/2018/wordml/cex" xmlns:w16cid="http://schemas.microsoft.com/office/word/2016/wordml/cid" xmlns:w16="http://schemas.microsoft.com/office/word/2018/wordml" xmlns:w16sdtdh="http://schemas.microsoft.com/office/word/2020/wordml/sdtdatahash" xmlns:w16sdtfl="http://schemas.microsoft.com/office/word/2024/wordml/sdtformatlock" xmlns:w16se="http://schemas.microsoft.com/office/word/2015/wordml/symex" xmlns:w16du="http://schemas.microsoft.com/office/word/2023/wordml/word16du" xmlns:wne="http://schemas.microsoft.com/office/word/2006/wordml" mc:Ignorable="w14 w15 w16se w16cid w16 w16cex w16sdtdh w16sdtfl w16du wp14">
   <w:p>
     <w:pPr>
       <w:pStyle w:val="En-tte"/>
@@ -1941,13 +2080,13 @@
 </file>
 
 <file path=word/header2.xml><?xml version="1.0" encoding="utf-8"?>
-<w:hdr xmlns:wpc="http://schemas.microsoft.com/office/word/2010/wordprocessingCanvas" xmlns:cx="http://schemas.microsoft.com/office/drawing/2014/chartex" xmlns:cx1="http://schemas.microsoft.com/office/drawing/2015/9/8/chartex" xmlns:cx2="http://schemas.microsoft.com/office/drawing/2015/10/21/chartex" xmlns:cx3="http://schemas.microsoft.com/office/drawing/2016/5/9/chartex" xmlns:cx4="http://schemas.microsoft.com/office/drawing/2016/5/10/chartex" xmlns:cx5="http://schemas.microsoft.com/office/drawing/2016/5/11/chartex" xmlns:cx6="http://schemas.microsoft.com/office/drawing/2016/5/12/chartex" xmlns:cx7="http://schemas.microsoft.com/office/drawing/2016/5/13/chartex" xmlns:cx8="http://schemas.microsoft.com/office/drawing/2016/5/14/chartex" xmlns:mc="http://schemas.openxmlformats.org/markup-compatibility/2006" xmlns:aink="http://schemas.microsoft.com/office/drawing/2016/ink" xmlns:am3d="http://schemas.microsoft.com/office/drawing/2017/model3d" xmlns:o="urn:schemas-microsoft-com:office:office" xmlns:oel="http://schemas.microsoft.com/office/2019/extlst" xmlns:r="http://schemas.openxmlformats.org/officeDocument/2006/relationships" xmlns:m="http://schemas.openxmlformats.org/officeDocument/2006/math" xmlns:v="urn:schemas-microsoft-com:vml" xmlns:wp14="http://schemas.microsoft.com/office/word/2010/wordprocessingDrawing" xmlns:wp="http://schemas.openxmlformats.org/drawingml/2006/wordprocessingDrawing" xmlns:w10="urn:schemas-microsoft-com:office:word" xmlns:w="http://schemas.openxmlformats.org/wordprocessingml/2006/main" xmlns:w14="http://schemas.microsoft.com/office/word/2010/wordml" xmlns:w15="http://schemas.microsoft.com/office/word/2012/wordml" xmlns:w16cex="http://schemas.microsoft.com/office/word/2018/wordml/cex" xmlns:w16cid="http://schemas.microsoft.com/office/word/2016/wordml/cid" xmlns:w16="http://schemas.microsoft.com/office/word/2018/wordml" xmlns:w16du="http://schemas.microsoft.com/office/word/2023/wordml/word16du" xmlns:w16sdtdh="http://schemas.microsoft.com/office/word/2020/wordml/sdtdatahash" xmlns:w16sdtfl="http://schemas.microsoft.com/office/word/2024/wordml/sdtformatlock" xmlns:w16se="http://schemas.microsoft.com/office/word/2015/wordml/symex" xmlns:wpg="http://schemas.microsoft.com/office/word/2010/wordprocessingGroup" xmlns:wpi="http://schemas.microsoft.com/office/word/2010/wordprocessingInk" xmlns:wne="http://schemas.microsoft.com/office/word/2006/wordml" xmlns:wps="http://schemas.microsoft.com/office/word/2010/wordprocessingShape" mc:Ignorable="w14 w15 w16se w16cid w16 w16cex w16sdtdh w16sdtfl w16du wp14">
+<w:hdr xmlns:wpc="http://schemas.microsoft.com/office/word/2010/wordprocessingCanvas" xmlns:cx="http://schemas.microsoft.com/office/drawing/2014/chartex" xmlns:cx1="http://schemas.microsoft.com/office/drawing/2015/9/8/chartex" xmlns:cx2="http://schemas.microsoft.com/office/drawing/2015/10/21/chartex" xmlns:cx3="http://schemas.microsoft.com/office/drawing/2016/5/9/chartex" xmlns:cx4="http://schemas.microsoft.com/office/drawing/2016/5/10/chartex" xmlns:cx5="http://schemas.microsoft.com/office/drawing/2016/5/11/chartex" xmlns:cx6="http://schemas.microsoft.com/office/drawing/2016/5/12/chartex" xmlns:cx7="http://schemas.microsoft.com/office/drawing/2016/5/13/chartex" xmlns:cx8="http://schemas.microsoft.com/office/drawing/2016/5/14/chartex" xmlns:mc="http://schemas.openxmlformats.org/markup-compatibility/2006" xmlns:m="http://schemas.openxmlformats.org/officeDocument/2006/math" xmlns:aink="http://schemas.microsoft.com/office/drawing/2016/ink" xmlns:am3d="http://schemas.microsoft.com/office/drawing/2017/model3d" xmlns:oel="http://schemas.microsoft.com/office/2019/extlst" xmlns:r="http://schemas.openxmlformats.org/officeDocument/2006/relationships" xmlns:wp14="http://schemas.microsoft.com/office/word/2010/wordprocessingDrawing" xmlns:wp="http://schemas.openxmlformats.org/drawingml/2006/wordprocessingDrawing" xmlns:wpg="http://schemas.microsoft.com/office/word/2010/wordprocessingGroup" xmlns:wpi="http://schemas.microsoft.com/office/word/2010/wordprocessingInk" xmlns:wps="http://schemas.microsoft.com/office/word/2010/wordprocessingShape" xmlns:o="urn:schemas-microsoft-com:office:office" xmlns:v="urn:schemas-microsoft-com:vml" xmlns:w10="urn:schemas-microsoft-com:office:word" xmlns:w="http://schemas.openxmlformats.org/wordprocessingml/2006/main" xmlns:w14="http://schemas.microsoft.com/office/word/2010/wordml" xmlns:w15="http://schemas.microsoft.com/office/word/2012/wordml" xmlns:w16cex="http://schemas.microsoft.com/office/word/2018/wordml/cex" xmlns:w16cid="http://schemas.microsoft.com/office/word/2016/wordml/cid" xmlns:w16="http://schemas.microsoft.com/office/word/2018/wordml" xmlns:w16sdtdh="http://schemas.microsoft.com/office/word/2020/wordml/sdtdatahash" xmlns:w16sdtfl="http://schemas.microsoft.com/office/word/2024/wordml/sdtformatlock" xmlns:w16se="http://schemas.microsoft.com/office/word/2015/wordml/symex" xmlns:w16du="http://schemas.microsoft.com/office/word/2023/wordml/word16du" xmlns:wne="http://schemas.microsoft.com/office/word/2006/wordml" mc:Ignorable="w14 w15 w16se w16cid w16 w16cex w16sdtdh w16sdtfl w16du wp14">
   <w:p/>
 </w:hdr>
 </file>
 
 <file path=word/header3.xml><?xml version="1.0" encoding="utf-8"?>
-<w:hdr xmlns:wpc="http://schemas.microsoft.com/office/word/2010/wordprocessingCanvas" xmlns:cx="http://schemas.microsoft.com/office/drawing/2014/chartex" xmlns:cx1="http://schemas.microsoft.com/office/drawing/2015/9/8/chartex" xmlns:cx2="http://schemas.microsoft.com/office/drawing/2015/10/21/chartex" xmlns:cx3="http://schemas.microsoft.com/office/drawing/2016/5/9/chartex" xmlns:cx4="http://schemas.microsoft.com/office/drawing/2016/5/10/chartex" xmlns:cx5="http://schemas.microsoft.com/office/drawing/2016/5/11/chartex" xmlns:cx6="http://schemas.microsoft.com/office/drawing/2016/5/12/chartex" xmlns:cx7="http://schemas.microsoft.com/office/drawing/2016/5/13/chartex" xmlns:cx8="http://schemas.microsoft.com/office/drawing/2016/5/14/chartex" xmlns:mc="http://schemas.openxmlformats.org/markup-compatibility/2006" xmlns:aink="http://schemas.microsoft.com/office/drawing/2016/ink" xmlns:am3d="http://schemas.microsoft.com/office/drawing/2017/model3d" xmlns:o="urn:schemas-microsoft-com:office:office" xmlns:oel="http://schemas.microsoft.com/office/2019/extlst" xmlns:r="http://schemas.openxmlformats.org/officeDocument/2006/relationships" xmlns:m="http://schemas.openxmlformats.org/officeDocument/2006/math" xmlns:v="urn:schemas-microsoft-com:vml" xmlns:wp14="http://schemas.microsoft.com/office/word/2010/wordprocessingDrawing" xmlns:wp="http://schemas.openxmlformats.org/drawingml/2006/wordprocessingDrawing" xmlns:w10="urn:schemas-microsoft-com:office:word" xmlns:w="http://schemas.openxmlformats.org/wordprocessingml/2006/main" xmlns:w14="http://schemas.microsoft.com/office/word/2010/wordml" xmlns:w15="http://schemas.microsoft.com/office/word/2012/wordml" xmlns:w16cex="http://schemas.microsoft.com/office/word/2018/wordml/cex" xmlns:w16cid="http://schemas.microsoft.com/office/word/2016/wordml/cid" xmlns:w16="http://schemas.microsoft.com/office/word/2018/wordml" xmlns:w16du="http://schemas.microsoft.com/office/word/2023/wordml/word16du" xmlns:w16sdtdh="http://schemas.microsoft.com/office/word/2020/wordml/sdtdatahash" xmlns:w16sdtfl="http://schemas.microsoft.com/office/word/2024/wordml/sdtformatlock" xmlns:w16se="http://schemas.microsoft.com/office/word/2015/wordml/symex" xmlns:wpg="http://schemas.microsoft.com/office/word/2010/wordprocessingGroup" xmlns:wpi="http://schemas.microsoft.com/office/word/2010/wordprocessingInk" xmlns:wne="http://schemas.microsoft.com/office/word/2006/wordml" xmlns:wps="http://schemas.microsoft.com/office/word/2010/wordprocessingShape" mc:Ignorable="w14 w15 w16se w16cid w16 w16cex w16sdtdh w16sdtfl w16du wp14">
+<w:hdr xmlns:wpc="http://schemas.microsoft.com/office/word/2010/wordprocessingCanvas" xmlns:cx="http://schemas.microsoft.com/office/drawing/2014/chartex" xmlns:cx1="http://schemas.microsoft.com/office/drawing/2015/9/8/chartex" xmlns:cx2="http://schemas.microsoft.com/office/drawing/2015/10/21/chartex" xmlns:cx3="http://schemas.microsoft.com/office/drawing/2016/5/9/chartex" xmlns:cx4="http://schemas.microsoft.com/office/drawing/2016/5/10/chartex" xmlns:cx5="http://schemas.microsoft.com/office/drawing/2016/5/11/chartex" xmlns:cx6="http://schemas.microsoft.com/office/drawing/2016/5/12/chartex" xmlns:cx7="http://schemas.microsoft.com/office/drawing/2016/5/13/chartex" xmlns:cx8="http://schemas.microsoft.com/office/drawing/2016/5/14/chartex" xmlns:mc="http://schemas.openxmlformats.org/markup-compatibility/2006" xmlns:m="http://schemas.openxmlformats.org/officeDocument/2006/math" xmlns:aink="http://schemas.microsoft.com/office/drawing/2016/ink" xmlns:am3d="http://schemas.microsoft.com/office/drawing/2017/model3d" xmlns:oel="http://schemas.microsoft.com/office/2019/extlst" xmlns:r="http://schemas.openxmlformats.org/officeDocument/2006/relationships" xmlns:wp14="http://schemas.microsoft.com/office/word/2010/wordprocessingDrawing" xmlns:wp="http://schemas.openxmlformats.org/drawingml/2006/wordprocessingDrawing" xmlns:wpg="http://schemas.microsoft.com/office/word/2010/wordprocessingGroup" xmlns:wpi="http://schemas.microsoft.com/office/word/2010/wordprocessingInk" xmlns:wps="http://schemas.microsoft.com/office/word/2010/wordprocessingShape" xmlns:o="urn:schemas-microsoft-com:office:office" xmlns:v="urn:schemas-microsoft-com:vml" xmlns:w10="urn:schemas-microsoft-com:office:word" xmlns:w="http://schemas.openxmlformats.org/wordprocessingml/2006/main" xmlns:w14="http://schemas.microsoft.com/office/word/2010/wordml" xmlns:w15="http://schemas.microsoft.com/office/word/2012/wordml" xmlns:w16cex="http://schemas.microsoft.com/office/word/2018/wordml/cex" xmlns:w16cid="http://schemas.microsoft.com/office/word/2016/wordml/cid" xmlns:w16="http://schemas.microsoft.com/office/word/2018/wordml" xmlns:w16sdtdh="http://schemas.microsoft.com/office/word/2020/wordml/sdtdatahash" xmlns:w16sdtfl="http://schemas.microsoft.com/office/word/2024/wordml/sdtformatlock" xmlns:w16se="http://schemas.microsoft.com/office/word/2015/wordml/symex" xmlns:w16du="http://schemas.microsoft.com/office/word/2023/wordml/word16du" xmlns:wne="http://schemas.microsoft.com/office/word/2006/wordml" mc:Ignorable="w14 w15 w16se w16cid w16 w16cex w16sdtdh w16sdtfl w16du wp14">
   <w:p>
     <w:pPr>
       <w:pStyle w:val="En-tte"/>
@@ -1957,7 +2096,7 @@
 </file>
 
 <file path=word/numbering.xml><?xml version="1.0" encoding="utf-8"?>
-<w:numbering xmlns:wpc="http://schemas.microsoft.com/office/word/2010/wordprocessingCanvas" xmlns:cx="http://schemas.microsoft.com/office/drawing/2014/chartex" xmlns:cx1="http://schemas.microsoft.com/office/drawing/2015/9/8/chartex" xmlns:cx2="http://schemas.microsoft.com/office/drawing/2015/10/21/chartex" xmlns:cx3="http://schemas.microsoft.com/office/drawing/2016/5/9/chartex" xmlns:cx4="http://schemas.microsoft.com/office/drawing/2016/5/10/chartex" xmlns:cx5="http://schemas.microsoft.com/office/drawing/2016/5/11/chartex" xmlns:cx6="http://schemas.microsoft.com/office/drawing/2016/5/12/chartex" xmlns:cx7="http://schemas.microsoft.com/office/drawing/2016/5/13/chartex" xmlns:cx8="http://schemas.microsoft.com/office/drawing/2016/5/14/chartex" xmlns:mc="http://schemas.openxmlformats.org/markup-compatibility/2006" xmlns:aink="http://schemas.microsoft.com/office/drawing/2016/ink" xmlns:am3d="http://schemas.microsoft.com/office/drawing/2017/model3d" xmlns:o="urn:schemas-microsoft-com:office:office" xmlns:oel="http://schemas.microsoft.com/office/2019/extlst" xmlns:r="http://schemas.openxmlformats.org/officeDocument/2006/relationships" xmlns:m="http://schemas.openxmlformats.org/officeDocument/2006/math" xmlns:v="urn:schemas-microsoft-com:vml" xmlns:wp14="http://schemas.microsoft.com/office/word/2010/wordprocessingDrawing" xmlns:wp="http://schemas.openxmlformats.org/drawingml/2006/wordprocessingDrawing" xmlns:w10="urn:schemas-microsoft-com:office:word" xmlns:w="http://schemas.openxmlformats.org/wordprocessingml/2006/main" xmlns:w14="http://schemas.microsoft.com/office/word/2010/wordml" xmlns:w15="http://schemas.microsoft.com/office/word/2012/wordml" xmlns:w16cex="http://schemas.microsoft.com/office/word/2018/wordml/cex" xmlns:w16cid="http://schemas.microsoft.com/office/word/2016/wordml/cid" xmlns:w16="http://schemas.microsoft.com/office/word/2018/wordml" xmlns:w16du="http://schemas.microsoft.com/office/word/2023/wordml/word16du" xmlns:w16sdtdh="http://schemas.microsoft.com/office/word/2020/wordml/sdtdatahash" xmlns:w16sdtfl="http://schemas.microsoft.com/office/word/2024/wordml/sdtformatlock" xmlns:w16se="http://schemas.microsoft.com/office/word/2015/wordml/symex" xmlns:wpg="http://schemas.microsoft.com/office/word/2010/wordprocessingGroup" xmlns:wpi="http://schemas.microsoft.com/office/word/2010/wordprocessingInk" xmlns:wne="http://schemas.microsoft.com/office/word/2006/wordml" xmlns:wps="http://schemas.microsoft.com/office/word/2010/wordprocessingShape" mc:Ignorable="w14 w15 w16se w16cid w16 w16cex w16sdtdh w16sdtfl w16du wp14">
+<w:numbering xmlns:wpc="http://schemas.microsoft.com/office/word/2010/wordprocessingCanvas" xmlns:cx="http://schemas.microsoft.com/office/drawing/2014/chartex" xmlns:cx1="http://schemas.microsoft.com/office/drawing/2015/9/8/chartex" xmlns:cx2="http://schemas.microsoft.com/office/drawing/2015/10/21/chartex" xmlns:cx3="http://schemas.microsoft.com/office/drawing/2016/5/9/chartex" xmlns:cx4="http://schemas.microsoft.com/office/drawing/2016/5/10/chartex" xmlns:cx5="http://schemas.microsoft.com/office/drawing/2016/5/11/chartex" xmlns:cx6="http://schemas.microsoft.com/office/drawing/2016/5/12/chartex" xmlns:cx7="http://schemas.microsoft.com/office/drawing/2016/5/13/chartex" xmlns:cx8="http://schemas.microsoft.com/office/drawing/2016/5/14/chartex" xmlns:mc="http://schemas.openxmlformats.org/markup-compatibility/2006" xmlns:m="http://schemas.openxmlformats.org/officeDocument/2006/math" xmlns:aink="http://schemas.microsoft.com/office/drawing/2016/ink" xmlns:am3d="http://schemas.microsoft.com/office/drawing/2017/model3d" xmlns:oel="http://schemas.microsoft.com/office/2019/extlst" xmlns:r="http://schemas.openxmlformats.org/officeDocument/2006/relationships" xmlns:wp14="http://schemas.microsoft.com/office/word/2010/wordprocessingDrawing" xmlns:wp="http://schemas.openxmlformats.org/drawingml/2006/wordprocessingDrawing" xmlns:wpg="http://schemas.microsoft.com/office/word/2010/wordprocessingGroup" xmlns:wpi="http://schemas.microsoft.com/office/word/2010/wordprocessingInk" xmlns:wps="http://schemas.microsoft.com/office/word/2010/wordprocessingShape" xmlns:o="urn:schemas-microsoft-com:office:office" xmlns:v="urn:schemas-microsoft-com:vml" xmlns:w10="urn:schemas-microsoft-com:office:word" xmlns:w="http://schemas.openxmlformats.org/wordprocessingml/2006/main" xmlns:w14="http://schemas.microsoft.com/office/word/2010/wordml" xmlns:w15="http://schemas.microsoft.com/office/word/2012/wordml" xmlns:w16cex="http://schemas.microsoft.com/office/word/2018/wordml/cex" xmlns:w16cid="http://schemas.microsoft.com/office/word/2016/wordml/cid" xmlns:w16="http://schemas.microsoft.com/office/word/2018/wordml" xmlns:w16sdtdh="http://schemas.microsoft.com/office/word/2020/wordml/sdtdatahash" xmlns:w16sdtfl="http://schemas.microsoft.com/office/word/2024/wordml/sdtformatlock" xmlns:w16se="http://schemas.microsoft.com/office/word/2015/wordml/symex" xmlns:w16du="http://schemas.microsoft.com/office/word/2023/wordml/word16du" xmlns:wne="http://schemas.microsoft.com/office/word/2006/wordml" mc:Ignorable="w14 w15 w16se w16cid w16 w16cex w16sdtdh w16sdtfl w16du wp14">
   <w:abstractNum w:abstractNumId="0" w15:restartNumberingAfterBreak="0">
     <w:nsid w:val="1E167504"/>
     <w:multiLevelType w:val="multilevel"/>
@@ -2570,7 +2709,7 @@
 </file>
 
 <file path=word/styles.xml><?xml version="1.0" encoding="utf-8"?>
-<w:styles xmlns:mc="http://schemas.openxmlformats.org/markup-compatibility/2006" xmlns:r="http://schemas.openxmlformats.org/officeDocument/2006/relationships" xmlns:w="http://schemas.openxmlformats.org/wordprocessingml/2006/main" xmlns:w14="http://schemas.microsoft.com/office/word/2010/wordml" xmlns:w15="http://schemas.microsoft.com/office/word/2012/wordml" xmlns:w16cex="http://schemas.microsoft.com/office/word/2018/wordml/cex" xmlns:w16cid="http://schemas.microsoft.com/office/word/2016/wordml/cid" xmlns:w16="http://schemas.microsoft.com/office/word/2018/wordml" xmlns:w16du="http://schemas.microsoft.com/office/word/2023/wordml/word16du" xmlns:w16sdtdh="http://schemas.microsoft.com/office/word/2020/wordml/sdtdatahash" xmlns:w16sdtfl="http://schemas.microsoft.com/office/word/2024/wordml/sdtformatlock" xmlns:w16se="http://schemas.microsoft.com/office/word/2015/wordml/symex" mc:Ignorable="w14 w15 w16se w16cid w16 w16cex w16sdtdh w16sdtfl w16du">
+<w:styles xmlns:mc="http://schemas.openxmlformats.org/markup-compatibility/2006" xmlns:r="http://schemas.openxmlformats.org/officeDocument/2006/relationships" xmlns:w="http://schemas.openxmlformats.org/wordprocessingml/2006/main" xmlns:w14="http://schemas.microsoft.com/office/word/2010/wordml" xmlns:w15="http://schemas.microsoft.com/office/word/2012/wordml" xmlns:w16cex="http://schemas.microsoft.com/office/word/2018/wordml/cex" xmlns:w16cid="http://schemas.microsoft.com/office/word/2016/wordml/cid" xmlns:w16="http://schemas.microsoft.com/office/word/2018/wordml" xmlns:w16sdtdh="http://schemas.microsoft.com/office/word/2020/wordml/sdtdatahash" xmlns:w16sdtfl="http://schemas.microsoft.com/office/word/2024/wordml/sdtformatlock" xmlns:w16se="http://schemas.microsoft.com/office/word/2015/wordml/symex" xmlns:w16du="http://schemas.microsoft.com/office/word/2023/wordml/word16du" mc:Ignorable="w14 w15 w16se w16cid w16 w16cex w16sdtdh w16sdtfl w16du">
   <w:docDefaults>
     <w:rPrDefault>
       <w:rPr>

</xml_diff>